<commit_message>
Revision and small corrections
</commit_message>
<xml_diff>
--- a/UuAP_CS2_Belma_Ajnur_Demir.docx
+++ b/UuAP_CS2_Belma_Ajnur_Demir.docx
@@ -1,6 +1,6 @@
 
 <file path=word/document.xml><?xml version="1.0" encoding="utf-8"?>
-<w:document xmlns:wpc="http://schemas.microsoft.com/office/word/2010/wordprocessingCanvas" xmlns:cx="http://schemas.microsoft.com/office/drawing/2014/chartex" xmlns:cx1="http://schemas.microsoft.com/office/drawing/2015/9/8/chartex" xmlns:cx2="http://schemas.microsoft.com/office/drawing/2015/10/21/chartex" xmlns:cx3="http://schemas.microsoft.com/office/drawing/2016/5/9/chartex" xmlns:cx4="http://schemas.microsoft.com/office/drawing/2016/5/10/chartex" xmlns:cx5="http://schemas.microsoft.com/office/drawing/2016/5/11/chartex" xmlns:cx6="http://schemas.microsoft.com/office/drawing/2016/5/12/chartex" xmlns:cx7="http://schemas.microsoft.com/office/drawing/2016/5/13/chartex" xmlns:cx8="http://schemas.microsoft.com/office/drawing/2016/5/14/chartex" xmlns:mc="http://schemas.openxmlformats.org/markup-compatibility/2006" xmlns:aink="http://schemas.microsoft.com/office/drawing/2016/ink" xmlns:am3d="http://schemas.microsoft.com/office/drawing/2017/model3d" xmlns:o="urn:schemas-microsoft-com:office:office" xmlns:r="http://schemas.openxmlformats.org/officeDocument/2006/relationships" xmlns:m="http://schemas.openxmlformats.org/officeDocument/2006/math" xmlns:v="urn:schemas-microsoft-com:vml" xmlns:wp14="http://schemas.microsoft.com/office/word/2010/wordprocessingDrawing" xmlns:wp="http://schemas.openxmlformats.org/drawingml/2006/wordprocessingDrawing" xmlns:w10="urn:schemas-microsoft-com:office:word" xmlns:w="http://schemas.openxmlformats.org/wordprocessingml/2006/main" xmlns:w14="http://schemas.microsoft.com/office/word/2010/wordml" xmlns:w15="http://schemas.microsoft.com/office/word/2012/wordml" xmlns:w16cex="http://schemas.microsoft.com/office/word/2018/wordml/cex" xmlns:w16cid="http://schemas.microsoft.com/office/word/2016/wordml/cid" xmlns:w16="http://schemas.microsoft.com/office/word/2018/wordml" xmlns:w16sdtdh="http://schemas.microsoft.com/office/word/2020/wordml/sdtdatahash" xmlns:w16se="http://schemas.microsoft.com/office/word/2015/wordml/symex" xmlns:wpg="http://schemas.microsoft.com/office/word/2010/wordprocessingGroup" xmlns:wpi="http://schemas.microsoft.com/office/word/2010/wordprocessingInk" xmlns:wne="http://schemas.microsoft.com/office/word/2006/wordml" xmlns:wps="http://schemas.microsoft.com/office/word/2010/wordprocessingShape" mc:Ignorable="w14 w15 w16se w16cid w16 w16cex w16sdtdh wp14">
+<w:document xmlns:wpc="http://schemas.microsoft.com/office/word/2010/wordprocessingCanvas" xmlns:cx="http://schemas.microsoft.com/office/drawing/2014/chartex" xmlns:cx1="http://schemas.microsoft.com/office/drawing/2015/9/8/chartex" xmlns:cx2="http://schemas.microsoft.com/office/drawing/2015/10/21/chartex" xmlns:cx3="http://schemas.microsoft.com/office/drawing/2016/5/9/chartex" xmlns:cx4="http://schemas.microsoft.com/office/drawing/2016/5/10/chartex" xmlns:cx5="http://schemas.microsoft.com/office/drawing/2016/5/11/chartex" xmlns:cx6="http://schemas.microsoft.com/office/drawing/2016/5/12/chartex" xmlns:cx7="http://schemas.microsoft.com/office/drawing/2016/5/13/chartex" xmlns:cx8="http://schemas.microsoft.com/office/drawing/2016/5/14/chartex" xmlns:mc="http://schemas.openxmlformats.org/markup-compatibility/2006" xmlns:aink="http://schemas.microsoft.com/office/drawing/2016/ink" xmlns:am3d="http://schemas.microsoft.com/office/drawing/2017/model3d" xmlns:o="urn:schemas-microsoft-com:office:office" xmlns:oel="http://schemas.microsoft.com/office/2019/extlst" xmlns:r="http://schemas.openxmlformats.org/officeDocument/2006/relationships" xmlns:m="http://schemas.openxmlformats.org/officeDocument/2006/math" xmlns:v="urn:schemas-microsoft-com:vml" xmlns:wp14="http://schemas.microsoft.com/office/word/2010/wordprocessingDrawing" xmlns:wp="http://schemas.openxmlformats.org/drawingml/2006/wordprocessingDrawing" xmlns:w10="urn:schemas-microsoft-com:office:word" xmlns:w="http://schemas.openxmlformats.org/wordprocessingml/2006/main" xmlns:w14="http://schemas.microsoft.com/office/word/2010/wordml" xmlns:w15="http://schemas.microsoft.com/office/word/2012/wordml" xmlns:w16cex="http://schemas.microsoft.com/office/word/2018/wordml/cex" xmlns:w16cid="http://schemas.microsoft.com/office/word/2016/wordml/cid" xmlns:w16="http://schemas.microsoft.com/office/word/2018/wordml" xmlns:w16du="http://schemas.microsoft.com/office/word/2023/wordml/word16du" xmlns:w16sdtdh="http://schemas.microsoft.com/office/word/2020/wordml/sdtdatahash" xmlns:w16sdtfl="http://schemas.microsoft.com/office/word/2024/wordml/sdtformatlock" xmlns:w16se="http://schemas.microsoft.com/office/word/2015/wordml/symex" xmlns:wpg="http://schemas.microsoft.com/office/word/2010/wordprocessingGroup" xmlns:wpi="http://schemas.microsoft.com/office/word/2010/wordprocessingInk" xmlns:wne="http://schemas.microsoft.com/office/word/2006/wordml" xmlns:wps="http://schemas.microsoft.com/office/word/2010/wordprocessingShape" mc:Ignorable="w14 w15 w16se w16cid w16 w16cex w16sdtdh w16sdtfl w16du wp14">
   <w:body>
     <w:p>
       <w:pPr>
@@ -84,7 +84,27 @@
           <w:sz w:val="32"/>
           <w:szCs w:val="32"/>
         </w:rPr>
-        <w:t>Airbnb cjenovni obrasci u mediteranskim gradovima: uloga lokacije, tipa smještaja i lokalnih tržišnih uvjeta</w:t>
+        <w:t xml:space="preserve">Airbnb cjenovni obrasci u mediteranskim gradovima: </w:t>
+      </w:r>
+      <w:r>
+        <w:rPr>
+          <w:rStyle w:val="x193iq5w"/>
+          <w:b/>
+          <w:bCs/>
+          <w:sz w:val="32"/>
+          <w:szCs w:val="32"/>
+        </w:rPr>
+        <w:t xml:space="preserve">               </w:t>
+      </w:r>
+      <w:r>
+        <w:rPr>
+          <w:rStyle w:val="x193iq5w"/>
+          <w:b/>
+          <w:bCs/>
+          <w:sz w:val="32"/>
+          <w:szCs w:val="32"/>
+        </w:rPr>
+        <w:t>uloga lokacije, tipa smještaja i lokalnih tržišnih uvjeta</w:t>
       </w:r>
     </w:p>
     <w:p>
@@ -262,10 +282,20 @@
           <w:rFonts w:eastAsia="Times New Roman" w:cs="Times New Roman"/>
           <w:noProof w:val="0"/>
           <w:kern w:val="0"/>
+          <w:lang w:eastAsia="bs-Latn-BA"/>
+          <w14:ligatures w14:val="none"/>
+        </w:rPr>
+        <w:t>R</w:t>
+      </w:r>
+      <w:r>
+        <w:rPr>
+          <w:rFonts w:eastAsia="Times New Roman" w:cs="Times New Roman"/>
+          <w:noProof w:val="0"/>
+          <w:kern w:val="0"/>
           <w:lang w:val="bs-Latn-BA" w:eastAsia="bs-Latn-BA"/>
           <w14:ligatures w14:val="none"/>
         </w:rPr>
-        <w:t>Ovaj rad istražuje faktore koji određuju cijenu smještaja na Airbnb platformi, s fokusom na uticaj geografske lokacije i tipa smještaja u šest mediteranskih i južnoeuropskih gradova: Ateni, Malagi, Istanbulu, Napulju, Rimu i Valenciji. Analiza je provedena na uzorku od 91.301 oglasa preuzetih s platforme Inside Airbnb za period septembar</w:t>
+        <w:t>ad istražuje faktore koji određuju cijenu smještaja na Airbnb platformi, s fokusom na uticaj geografske lokacije i tipa smještaja u šest mediteranskih i južnoeuropskih gradova: Ateni, Malagi, Istanbulu, Napulju, Rimu i Valenciji. Analiza je provedena na uzorku od 91.301 oglasa preuzetih s platforme Inside Airbnb za period septembar</w:t>
       </w:r>
       <w:r>
         <w:rPr>
@@ -366,11 +396,7 @@
             <w:pStyle w:val="TOC1"/>
             <w:rPr>
               <w:rFonts w:asciiTheme="minorHAnsi" w:eastAsiaTheme="minorEastAsia" w:hAnsiTheme="minorHAnsi"/>
-              <w:kern w:val="0"/>
-              <w:sz w:val="22"/>
-              <w:szCs w:val="22"/>
-              <w:lang w:val="bs-Latn-BA" w:eastAsia="bs-Latn-BA"/>
-              <w14:ligatures w14:val="none"/>
+              <w:lang w:val="en-US"/>
             </w:rPr>
           </w:pPr>
           <w:r>
@@ -382,7 +408,7 @@
           <w:r>
             <w:fldChar w:fldCharType="separate"/>
           </w:r>
-          <w:hyperlink w:anchor="_Toc230557947" w:history="1">
+          <w:hyperlink w:anchor="_Toc230624063" w:history="1">
             <w:r>
               <w:rPr>
                 <w:rStyle w:val="Hyperlink"/>
@@ -392,11 +418,7 @@
             <w:r>
               <w:rPr>
                 <w:rFonts w:asciiTheme="minorHAnsi" w:eastAsiaTheme="minorEastAsia" w:hAnsiTheme="minorHAnsi"/>
-                <w:kern w:val="0"/>
-                <w:sz w:val="22"/>
-                <w:szCs w:val="22"/>
-                <w:lang w:val="bs-Latn-BA" w:eastAsia="bs-Latn-BA"/>
-                <w14:ligatures w14:val="none"/>
+                <w:lang w:val="en-US"/>
               </w:rPr>
               <w:tab/>
             </w:r>
@@ -422,7 +444,7 @@
               <w:rPr>
                 <w:webHidden/>
               </w:rPr>
-              <w:instrText xml:space="preserve"> PAGEREF _Toc230557947 \h </w:instrText>
+              <w:instrText xml:space="preserve"> PAGEREF _Toc230624063 \h </w:instrText>
             </w:r>
             <w:r>
               <w:rPr>
@@ -454,14 +476,10 @@
             <w:pStyle w:val="TOC1"/>
             <w:rPr>
               <w:rFonts w:asciiTheme="minorHAnsi" w:eastAsiaTheme="minorEastAsia" w:hAnsiTheme="minorHAnsi"/>
-              <w:kern w:val="0"/>
-              <w:sz w:val="22"/>
-              <w:szCs w:val="22"/>
-              <w:lang w:val="bs-Latn-BA" w:eastAsia="bs-Latn-BA"/>
-              <w14:ligatures w14:val="none"/>
+              <w:lang w:val="en-US"/>
             </w:rPr>
           </w:pPr>
-          <w:hyperlink w:anchor="_Toc230557948" w:history="1">
+          <w:hyperlink w:anchor="_Toc230624064" w:history="1">
             <w:r>
               <w:rPr>
                 <w:rStyle w:val="Hyperlink"/>
@@ -471,11 +489,7 @@
             <w:r>
               <w:rPr>
                 <w:rFonts w:asciiTheme="minorHAnsi" w:eastAsiaTheme="minorEastAsia" w:hAnsiTheme="minorHAnsi"/>
-                <w:kern w:val="0"/>
-                <w:sz w:val="22"/>
-                <w:szCs w:val="22"/>
-                <w:lang w:val="bs-Latn-BA" w:eastAsia="bs-Latn-BA"/>
-                <w14:ligatures w14:val="none"/>
+                <w:lang w:val="en-US"/>
               </w:rPr>
               <w:tab/>
             </w:r>
@@ -501,7 +515,7 @@
               <w:rPr>
                 <w:webHidden/>
               </w:rPr>
-              <w:instrText xml:space="preserve"> PAGEREF _Toc230557948 \h </w:instrText>
+              <w:instrText xml:space="preserve"> PAGEREF _Toc230624064 \h </w:instrText>
             </w:r>
             <w:r>
               <w:rPr>
@@ -532,19 +546,15 @@
           <w:pPr>
             <w:pStyle w:val="TOC2"/>
             <w:tabs>
-              <w:tab w:val="left" w:pos="880"/>
+              <w:tab w:val="left" w:pos="960"/>
               <w:tab w:val="right" w:leader="dot" w:pos="9350"/>
             </w:tabs>
             <w:rPr>
               <w:rFonts w:asciiTheme="minorHAnsi" w:eastAsiaTheme="minorEastAsia" w:hAnsiTheme="minorHAnsi"/>
-              <w:kern w:val="0"/>
-              <w:sz w:val="22"/>
-              <w:szCs w:val="22"/>
-              <w:lang w:val="bs-Latn-BA" w:eastAsia="bs-Latn-BA"/>
-              <w14:ligatures w14:val="none"/>
+              <w:lang w:val="en-US"/>
             </w:rPr>
           </w:pPr>
-          <w:hyperlink w:anchor="_Toc230557949" w:history="1">
+          <w:hyperlink w:anchor="_Toc230624065" w:history="1">
             <w:r>
               <w:rPr>
                 <w:rStyle w:val="Hyperlink"/>
@@ -554,11 +564,7 @@
             <w:r>
               <w:rPr>
                 <w:rFonts w:asciiTheme="minorHAnsi" w:eastAsiaTheme="minorEastAsia" w:hAnsiTheme="minorHAnsi"/>
-                <w:kern w:val="0"/>
-                <w:sz w:val="22"/>
-                <w:szCs w:val="22"/>
-                <w:lang w:val="bs-Latn-BA" w:eastAsia="bs-Latn-BA"/>
-                <w14:ligatures w14:val="none"/>
+                <w:lang w:val="en-US"/>
               </w:rPr>
               <w:tab/>
             </w:r>
@@ -584,7 +590,7 @@
               <w:rPr>
                 <w:webHidden/>
               </w:rPr>
-              <w:instrText xml:space="preserve"> PAGEREF _Toc230557949 \h </w:instrText>
+              <w:instrText xml:space="preserve"> PAGEREF _Toc230624065 \h </w:instrText>
             </w:r>
             <w:r>
               <w:rPr>
@@ -615,19 +621,15 @@
           <w:pPr>
             <w:pStyle w:val="TOC2"/>
             <w:tabs>
-              <w:tab w:val="left" w:pos="880"/>
+              <w:tab w:val="left" w:pos="960"/>
               <w:tab w:val="right" w:leader="dot" w:pos="9350"/>
             </w:tabs>
             <w:rPr>
               <w:rFonts w:asciiTheme="minorHAnsi" w:eastAsiaTheme="minorEastAsia" w:hAnsiTheme="minorHAnsi"/>
-              <w:kern w:val="0"/>
-              <w:sz w:val="22"/>
-              <w:szCs w:val="22"/>
-              <w:lang w:val="bs-Latn-BA" w:eastAsia="bs-Latn-BA"/>
-              <w14:ligatures w14:val="none"/>
+              <w:lang w:val="en-US"/>
             </w:rPr>
           </w:pPr>
-          <w:hyperlink w:anchor="_Toc230557950" w:history="1">
+          <w:hyperlink w:anchor="_Toc230624066" w:history="1">
             <w:r>
               <w:rPr>
                 <w:rStyle w:val="Hyperlink"/>
@@ -637,11 +639,7 @@
             <w:r>
               <w:rPr>
                 <w:rFonts w:asciiTheme="minorHAnsi" w:eastAsiaTheme="minorEastAsia" w:hAnsiTheme="minorHAnsi"/>
-                <w:kern w:val="0"/>
-                <w:sz w:val="22"/>
-                <w:szCs w:val="22"/>
-                <w:lang w:val="bs-Latn-BA" w:eastAsia="bs-Latn-BA"/>
-                <w14:ligatures w14:val="none"/>
+                <w:lang w:val="en-US"/>
               </w:rPr>
               <w:tab/>
             </w:r>
@@ -667,7 +665,7 @@
               <w:rPr>
                 <w:webHidden/>
               </w:rPr>
-              <w:instrText xml:space="preserve"> PAGEREF _Toc230557950 \h </w:instrText>
+              <w:instrText xml:space="preserve"> PAGEREF _Toc230624066 \h </w:instrText>
             </w:r>
             <w:r>
               <w:rPr>
@@ -698,19 +696,15 @@
           <w:pPr>
             <w:pStyle w:val="TOC2"/>
             <w:tabs>
-              <w:tab w:val="left" w:pos="880"/>
+              <w:tab w:val="left" w:pos="960"/>
               <w:tab w:val="right" w:leader="dot" w:pos="9350"/>
             </w:tabs>
             <w:rPr>
               <w:rFonts w:asciiTheme="minorHAnsi" w:eastAsiaTheme="minorEastAsia" w:hAnsiTheme="minorHAnsi"/>
-              <w:kern w:val="0"/>
-              <w:sz w:val="22"/>
-              <w:szCs w:val="22"/>
-              <w:lang w:val="bs-Latn-BA" w:eastAsia="bs-Latn-BA"/>
-              <w14:ligatures w14:val="none"/>
+              <w:lang w:val="en-US"/>
             </w:rPr>
           </w:pPr>
-          <w:hyperlink w:anchor="_Toc230557951" w:history="1">
+          <w:hyperlink w:anchor="_Toc230624067" w:history="1">
             <w:r>
               <w:rPr>
                 <w:rStyle w:val="Hyperlink"/>
@@ -720,11 +714,7 @@
             <w:r>
               <w:rPr>
                 <w:rFonts w:asciiTheme="minorHAnsi" w:eastAsiaTheme="minorEastAsia" w:hAnsiTheme="minorHAnsi"/>
-                <w:kern w:val="0"/>
-                <w:sz w:val="22"/>
-                <w:szCs w:val="22"/>
-                <w:lang w:val="bs-Latn-BA" w:eastAsia="bs-Latn-BA"/>
-                <w14:ligatures w14:val="none"/>
+                <w:lang w:val="en-US"/>
               </w:rPr>
               <w:tab/>
             </w:r>
@@ -750,7 +740,7 @@
               <w:rPr>
                 <w:webHidden/>
               </w:rPr>
-              <w:instrText xml:space="preserve"> PAGEREF _Toc230557951 \h </w:instrText>
+              <w:instrText xml:space="preserve"> PAGEREF _Toc230624067 \h </w:instrText>
             </w:r>
             <w:r>
               <w:rPr>
@@ -782,14 +772,10 @@
             <w:pStyle w:val="TOC1"/>
             <w:rPr>
               <w:rFonts w:asciiTheme="minorHAnsi" w:eastAsiaTheme="minorEastAsia" w:hAnsiTheme="minorHAnsi"/>
-              <w:kern w:val="0"/>
-              <w:sz w:val="22"/>
-              <w:szCs w:val="22"/>
-              <w:lang w:val="bs-Latn-BA" w:eastAsia="bs-Latn-BA"/>
-              <w14:ligatures w14:val="none"/>
+              <w:lang w:val="en-US"/>
             </w:rPr>
           </w:pPr>
-          <w:hyperlink w:anchor="_Toc230557952" w:history="1">
+          <w:hyperlink w:anchor="_Toc230624068" w:history="1">
             <w:r>
               <w:rPr>
                 <w:rStyle w:val="Hyperlink"/>
@@ -799,11 +785,7 @@
             <w:r>
               <w:rPr>
                 <w:rFonts w:asciiTheme="minorHAnsi" w:eastAsiaTheme="minorEastAsia" w:hAnsiTheme="minorHAnsi"/>
-                <w:kern w:val="0"/>
-                <w:sz w:val="22"/>
-                <w:szCs w:val="22"/>
-                <w:lang w:val="bs-Latn-BA" w:eastAsia="bs-Latn-BA"/>
-                <w14:ligatures w14:val="none"/>
+                <w:lang w:val="en-US"/>
               </w:rPr>
               <w:tab/>
             </w:r>
@@ -829,7 +811,7 @@
               <w:rPr>
                 <w:webHidden/>
               </w:rPr>
-              <w:instrText xml:space="preserve"> PAGEREF _Toc230557952 \h </w:instrText>
+              <w:instrText xml:space="preserve"> PAGEREF _Toc230624068 \h </w:instrText>
             </w:r>
             <w:r>
               <w:rPr>
@@ -860,19 +842,15 @@
           <w:pPr>
             <w:pStyle w:val="TOC2"/>
             <w:tabs>
-              <w:tab w:val="left" w:pos="880"/>
+              <w:tab w:val="left" w:pos="960"/>
               <w:tab w:val="right" w:leader="dot" w:pos="9350"/>
             </w:tabs>
             <w:rPr>
               <w:rFonts w:asciiTheme="minorHAnsi" w:eastAsiaTheme="minorEastAsia" w:hAnsiTheme="minorHAnsi"/>
-              <w:kern w:val="0"/>
-              <w:sz w:val="22"/>
-              <w:szCs w:val="22"/>
-              <w:lang w:val="bs-Latn-BA" w:eastAsia="bs-Latn-BA"/>
-              <w14:ligatures w14:val="none"/>
+              <w:lang w:val="en-US"/>
             </w:rPr>
           </w:pPr>
-          <w:hyperlink w:anchor="_Toc230557953" w:history="1">
+          <w:hyperlink w:anchor="_Toc230624069" w:history="1">
             <w:r>
               <w:rPr>
                 <w:rStyle w:val="Hyperlink"/>
@@ -883,11 +861,7 @@
             <w:r>
               <w:rPr>
                 <w:rFonts w:asciiTheme="minorHAnsi" w:eastAsiaTheme="minorEastAsia" w:hAnsiTheme="minorHAnsi"/>
-                <w:kern w:val="0"/>
-                <w:sz w:val="22"/>
-                <w:szCs w:val="22"/>
-                <w:lang w:val="bs-Latn-BA" w:eastAsia="bs-Latn-BA"/>
-                <w14:ligatures w14:val="none"/>
+                <w:lang w:val="en-US"/>
               </w:rPr>
               <w:tab/>
             </w:r>
@@ -913,7 +887,7 @@
               <w:rPr>
                 <w:webHidden/>
               </w:rPr>
-              <w:instrText xml:space="preserve"> PAGEREF _Toc230557953 \h </w:instrText>
+              <w:instrText xml:space="preserve"> PAGEREF _Toc230624069 \h </w:instrText>
             </w:r>
             <w:r>
               <w:rPr>
@@ -944,19 +918,15 @@
           <w:pPr>
             <w:pStyle w:val="TOC2"/>
             <w:tabs>
-              <w:tab w:val="left" w:pos="880"/>
+              <w:tab w:val="left" w:pos="960"/>
               <w:tab w:val="right" w:leader="dot" w:pos="9350"/>
             </w:tabs>
             <w:rPr>
               <w:rFonts w:asciiTheme="minorHAnsi" w:eastAsiaTheme="minorEastAsia" w:hAnsiTheme="minorHAnsi"/>
-              <w:kern w:val="0"/>
-              <w:sz w:val="22"/>
-              <w:szCs w:val="22"/>
-              <w:lang w:val="bs-Latn-BA" w:eastAsia="bs-Latn-BA"/>
-              <w14:ligatures w14:val="none"/>
+              <w:lang w:val="en-US"/>
             </w:rPr>
           </w:pPr>
-          <w:hyperlink w:anchor="_Toc230557954" w:history="1">
+          <w:hyperlink w:anchor="_Toc230624070" w:history="1">
             <w:r>
               <w:rPr>
                 <w:rStyle w:val="Hyperlink"/>
@@ -966,11 +936,7 @@
             <w:r>
               <w:rPr>
                 <w:rFonts w:asciiTheme="minorHAnsi" w:eastAsiaTheme="minorEastAsia" w:hAnsiTheme="minorHAnsi"/>
-                <w:kern w:val="0"/>
-                <w:sz w:val="22"/>
-                <w:szCs w:val="22"/>
-                <w:lang w:val="bs-Latn-BA" w:eastAsia="bs-Latn-BA"/>
-                <w14:ligatures w14:val="none"/>
+                <w:lang w:val="en-US"/>
               </w:rPr>
               <w:tab/>
             </w:r>
@@ -996,7 +962,7 @@
               <w:rPr>
                 <w:webHidden/>
               </w:rPr>
-              <w:instrText xml:space="preserve"> PAGEREF _Toc230557954 \h </w:instrText>
+              <w:instrText xml:space="preserve"> PAGEREF _Toc230624070 \h </w:instrText>
             </w:r>
             <w:r>
               <w:rPr>
@@ -1027,19 +993,15 @@
           <w:pPr>
             <w:pStyle w:val="TOC2"/>
             <w:tabs>
-              <w:tab w:val="left" w:pos="880"/>
+              <w:tab w:val="left" w:pos="960"/>
               <w:tab w:val="right" w:leader="dot" w:pos="9350"/>
             </w:tabs>
             <w:rPr>
               <w:rFonts w:asciiTheme="minorHAnsi" w:eastAsiaTheme="minorEastAsia" w:hAnsiTheme="minorHAnsi"/>
-              <w:kern w:val="0"/>
-              <w:sz w:val="22"/>
-              <w:szCs w:val="22"/>
-              <w:lang w:val="bs-Latn-BA" w:eastAsia="bs-Latn-BA"/>
-              <w14:ligatures w14:val="none"/>
+              <w:lang w:val="en-US"/>
             </w:rPr>
           </w:pPr>
-          <w:hyperlink w:anchor="_Toc230557955" w:history="1">
+          <w:hyperlink w:anchor="_Toc230624071" w:history="1">
             <w:r>
               <w:rPr>
                 <w:rStyle w:val="Hyperlink"/>
@@ -1049,11 +1011,7 @@
             <w:r>
               <w:rPr>
                 <w:rFonts w:asciiTheme="minorHAnsi" w:eastAsiaTheme="minorEastAsia" w:hAnsiTheme="minorHAnsi"/>
-                <w:kern w:val="0"/>
-                <w:sz w:val="22"/>
-                <w:szCs w:val="22"/>
-                <w:lang w:val="bs-Latn-BA" w:eastAsia="bs-Latn-BA"/>
-                <w14:ligatures w14:val="none"/>
+                <w:lang w:val="en-US"/>
               </w:rPr>
               <w:tab/>
             </w:r>
@@ -1079,7 +1037,7 @@
               <w:rPr>
                 <w:webHidden/>
               </w:rPr>
-              <w:instrText xml:space="preserve"> PAGEREF _Toc230557955 \h </w:instrText>
+              <w:instrText xml:space="preserve"> PAGEREF _Toc230624071 \h </w:instrText>
             </w:r>
             <w:r>
               <w:rPr>
@@ -1110,19 +1068,15 @@
           <w:pPr>
             <w:pStyle w:val="TOC2"/>
             <w:tabs>
-              <w:tab w:val="left" w:pos="880"/>
+              <w:tab w:val="left" w:pos="960"/>
               <w:tab w:val="right" w:leader="dot" w:pos="9350"/>
             </w:tabs>
             <w:rPr>
               <w:rFonts w:asciiTheme="minorHAnsi" w:eastAsiaTheme="minorEastAsia" w:hAnsiTheme="minorHAnsi"/>
-              <w:kern w:val="0"/>
-              <w:sz w:val="22"/>
-              <w:szCs w:val="22"/>
-              <w:lang w:val="bs-Latn-BA" w:eastAsia="bs-Latn-BA"/>
-              <w14:ligatures w14:val="none"/>
+              <w:lang w:val="en-US"/>
             </w:rPr>
           </w:pPr>
-          <w:hyperlink w:anchor="_Toc230557956" w:history="1">
+          <w:hyperlink w:anchor="_Toc230624072" w:history="1">
             <w:r>
               <w:rPr>
                 <w:rStyle w:val="Hyperlink"/>
@@ -1132,11 +1086,7 @@
             <w:r>
               <w:rPr>
                 <w:rFonts w:asciiTheme="minorHAnsi" w:eastAsiaTheme="minorEastAsia" w:hAnsiTheme="minorHAnsi"/>
-                <w:kern w:val="0"/>
-                <w:sz w:val="22"/>
-                <w:szCs w:val="22"/>
-                <w:lang w:val="bs-Latn-BA" w:eastAsia="bs-Latn-BA"/>
-                <w14:ligatures w14:val="none"/>
+                <w:lang w:val="en-US"/>
               </w:rPr>
               <w:tab/>
             </w:r>
@@ -1162,7 +1112,7 @@
               <w:rPr>
                 <w:webHidden/>
               </w:rPr>
-              <w:instrText xml:space="preserve"> PAGEREF _Toc230557956 \h </w:instrText>
+              <w:instrText xml:space="preserve"> PAGEREF _Toc230624072 \h </w:instrText>
             </w:r>
             <w:r>
               <w:rPr>
@@ -1193,19 +1143,15 @@
           <w:pPr>
             <w:pStyle w:val="TOC2"/>
             <w:tabs>
-              <w:tab w:val="left" w:pos="880"/>
+              <w:tab w:val="left" w:pos="960"/>
               <w:tab w:val="right" w:leader="dot" w:pos="9350"/>
             </w:tabs>
             <w:rPr>
               <w:rFonts w:asciiTheme="minorHAnsi" w:eastAsiaTheme="minorEastAsia" w:hAnsiTheme="minorHAnsi"/>
-              <w:kern w:val="0"/>
-              <w:sz w:val="22"/>
-              <w:szCs w:val="22"/>
-              <w:lang w:val="bs-Latn-BA" w:eastAsia="bs-Latn-BA"/>
-              <w14:ligatures w14:val="none"/>
+              <w:lang w:val="en-US"/>
             </w:rPr>
           </w:pPr>
-          <w:hyperlink w:anchor="_Toc230557957" w:history="1">
+          <w:hyperlink w:anchor="_Toc230624073" w:history="1">
             <w:r>
               <w:rPr>
                 <w:rStyle w:val="Hyperlink"/>
@@ -1215,11 +1161,7 @@
             <w:r>
               <w:rPr>
                 <w:rFonts w:asciiTheme="minorHAnsi" w:eastAsiaTheme="minorEastAsia" w:hAnsiTheme="minorHAnsi"/>
-                <w:kern w:val="0"/>
-                <w:sz w:val="22"/>
-                <w:szCs w:val="22"/>
-                <w:lang w:val="bs-Latn-BA" w:eastAsia="bs-Latn-BA"/>
-                <w14:ligatures w14:val="none"/>
+                <w:lang w:val="en-US"/>
               </w:rPr>
               <w:tab/>
             </w:r>
@@ -1245,7 +1187,7 @@
               <w:rPr>
                 <w:webHidden/>
               </w:rPr>
-              <w:instrText xml:space="preserve"> PAGEREF _Toc230557957 \h </w:instrText>
+              <w:instrText xml:space="preserve"> PAGEREF _Toc230624073 \h </w:instrText>
             </w:r>
             <w:r>
               <w:rPr>
@@ -1276,19 +1218,15 @@
           <w:pPr>
             <w:pStyle w:val="TOC2"/>
             <w:tabs>
-              <w:tab w:val="left" w:pos="880"/>
+              <w:tab w:val="left" w:pos="960"/>
               <w:tab w:val="right" w:leader="dot" w:pos="9350"/>
             </w:tabs>
             <w:rPr>
               <w:rFonts w:asciiTheme="minorHAnsi" w:eastAsiaTheme="minorEastAsia" w:hAnsiTheme="minorHAnsi"/>
-              <w:kern w:val="0"/>
-              <w:sz w:val="22"/>
-              <w:szCs w:val="22"/>
-              <w:lang w:val="bs-Latn-BA" w:eastAsia="bs-Latn-BA"/>
-              <w14:ligatures w14:val="none"/>
+              <w:lang w:val="en-US"/>
             </w:rPr>
           </w:pPr>
-          <w:hyperlink w:anchor="_Toc230557958" w:history="1">
+          <w:hyperlink w:anchor="_Toc230624074" w:history="1">
             <w:r>
               <w:rPr>
                 <w:rStyle w:val="Hyperlink"/>
@@ -1298,11 +1236,7 @@
             <w:r>
               <w:rPr>
                 <w:rFonts w:asciiTheme="minorHAnsi" w:eastAsiaTheme="minorEastAsia" w:hAnsiTheme="minorHAnsi"/>
-                <w:kern w:val="0"/>
-                <w:sz w:val="22"/>
-                <w:szCs w:val="22"/>
-                <w:lang w:val="bs-Latn-BA" w:eastAsia="bs-Latn-BA"/>
-                <w14:ligatures w14:val="none"/>
+                <w:lang w:val="en-US"/>
               </w:rPr>
               <w:tab/>
             </w:r>
@@ -1328,7 +1262,7 @@
               <w:rPr>
                 <w:webHidden/>
               </w:rPr>
-              <w:instrText xml:space="preserve"> PAGEREF _Toc230557958 \h </w:instrText>
+              <w:instrText xml:space="preserve"> PAGEREF _Toc230624074 \h </w:instrText>
             </w:r>
             <w:r>
               <w:rPr>
@@ -1359,19 +1293,15 @@
           <w:pPr>
             <w:pStyle w:val="TOC2"/>
             <w:tabs>
-              <w:tab w:val="left" w:pos="880"/>
+              <w:tab w:val="left" w:pos="960"/>
               <w:tab w:val="right" w:leader="dot" w:pos="9350"/>
             </w:tabs>
             <w:rPr>
               <w:rFonts w:asciiTheme="minorHAnsi" w:eastAsiaTheme="minorEastAsia" w:hAnsiTheme="minorHAnsi"/>
-              <w:kern w:val="0"/>
-              <w:sz w:val="22"/>
-              <w:szCs w:val="22"/>
-              <w:lang w:val="bs-Latn-BA" w:eastAsia="bs-Latn-BA"/>
-              <w14:ligatures w14:val="none"/>
+              <w:lang w:val="en-US"/>
             </w:rPr>
           </w:pPr>
-          <w:hyperlink w:anchor="_Toc230557959" w:history="1">
+          <w:hyperlink w:anchor="_Toc230624075" w:history="1">
             <w:r>
               <w:rPr>
                 <w:rStyle w:val="Hyperlink"/>
@@ -1381,11 +1311,7 @@
             <w:r>
               <w:rPr>
                 <w:rFonts w:asciiTheme="minorHAnsi" w:eastAsiaTheme="minorEastAsia" w:hAnsiTheme="minorHAnsi"/>
-                <w:kern w:val="0"/>
-                <w:sz w:val="22"/>
-                <w:szCs w:val="22"/>
-                <w:lang w:val="bs-Latn-BA" w:eastAsia="bs-Latn-BA"/>
-                <w14:ligatures w14:val="none"/>
+                <w:lang w:val="en-US"/>
               </w:rPr>
               <w:tab/>
             </w:r>
@@ -1411,7 +1337,7 @@
               <w:rPr>
                 <w:webHidden/>
               </w:rPr>
-              <w:instrText xml:space="preserve"> PAGEREF _Toc230557959 \h </w:instrText>
+              <w:instrText xml:space="preserve"> PAGEREF _Toc230624075 \h </w:instrText>
             </w:r>
             <w:r>
               <w:rPr>
@@ -1443,14 +1369,10 @@
             <w:pStyle w:val="TOC1"/>
             <w:rPr>
               <w:rFonts w:asciiTheme="minorHAnsi" w:eastAsiaTheme="minorEastAsia" w:hAnsiTheme="minorHAnsi"/>
-              <w:kern w:val="0"/>
-              <w:sz w:val="22"/>
-              <w:szCs w:val="22"/>
-              <w:lang w:val="bs-Latn-BA" w:eastAsia="bs-Latn-BA"/>
-              <w14:ligatures w14:val="none"/>
+              <w:lang w:val="en-US"/>
             </w:rPr>
           </w:pPr>
-          <w:hyperlink w:anchor="_Toc230557960" w:history="1">
+          <w:hyperlink w:anchor="_Toc230624076" w:history="1">
             <w:r>
               <w:rPr>
                 <w:rStyle w:val="Hyperlink"/>
@@ -1460,11 +1382,7 @@
             <w:r>
               <w:rPr>
                 <w:rFonts w:asciiTheme="minorHAnsi" w:eastAsiaTheme="minorEastAsia" w:hAnsiTheme="minorHAnsi"/>
-                <w:kern w:val="0"/>
-                <w:sz w:val="22"/>
-                <w:szCs w:val="22"/>
-                <w:lang w:val="bs-Latn-BA" w:eastAsia="bs-Latn-BA"/>
-                <w14:ligatures w14:val="none"/>
+                <w:lang w:val="en-US"/>
               </w:rPr>
               <w:tab/>
             </w:r>
@@ -1490,7 +1408,7 @@
               <w:rPr>
                 <w:webHidden/>
               </w:rPr>
-              <w:instrText xml:space="preserve"> PAGEREF _Toc230557960 \h </w:instrText>
+              <w:instrText xml:space="preserve"> PAGEREF _Toc230624076 \h </w:instrText>
             </w:r>
             <w:r>
               <w:rPr>
@@ -1508,6 +1426,64 @@
                 <w:webHidden/>
               </w:rPr>
               <w:t>11</w:t>
+            </w:r>
+            <w:r>
+              <w:rPr>
+                <w:webHidden/>
+              </w:rPr>
+              <w:fldChar w:fldCharType="end"/>
+            </w:r>
+          </w:hyperlink>
+        </w:p>
+        <w:p>
+          <w:pPr>
+            <w:pStyle w:val="TOC1"/>
+            <w:rPr>
+              <w:rFonts w:asciiTheme="minorHAnsi" w:eastAsiaTheme="minorEastAsia" w:hAnsiTheme="minorHAnsi"/>
+              <w:lang w:val="en-US"/>
+            </w:rPr>
+          </w:pPr>
+          <w:hyperlink w:anchor="_Toc230624077" w:history="1">
+            <w:r>
+              <w:rPr>
+                <w:rStyle w:val="Hyperlink"/>
+              </w:rPr>
+              <w:t>LITERATURA</w:t>
+            </w:r>
+            <w:r>
+              <w:rPr>
+                <w:webHidden/>
+              </w:rPr>
+              <w:tab/>
+            </w:r>
+            <w:r>
+              <w:rPr>
+                <w:webHidden/>
+              </w:rPr>
+              <w:fldChar w:fldCharType="begin"/>
+            </w:r>
+            <w:r>
+              <w:rPr>
+                <w:webHidden/>
+              </w:rPr>
+              <w:instrText xml:space="preserve"> PAGEREF _Toc230624077 \h </w:instrText>
+            </w:r>
+            <w:r>
+              <w:rPr>
+                <w:webHidden/>
+              </w:rPr>
+            </w:r>
+            <w:r>
+              <w:rPr>
+                <w:webHidden/>
+              </w:rPr>
+              <w:fldChar w:fldCharType="separate"/>
+            </w:r>
+            <w:r>
+              <w:rPr>
+                <w:webHidden/>
+              </w:rPr>
+              <w:t>12</w:t>
             </w:r>
             <w:r>
               <w:rPr>
@@ -1540,7 +1516,7 @@
       <w:pPr>
         <w:pStyle w:val="Heading1"/>
       </w:pPr>
-      <w:bookmarkStart w:id="0" w:name="_Toc230557947"/>
+      <w:bookmarkStart w:id="0" w:name="_Toc230624063"/>
       <w:r>
         <w:lastRenderedPageBreak/>
         <w:t xml:space="preserve">UVOD </w:t>
@@ -1560,10 +1536,25 @@
     </w:p>
     <w:p>
       <w:r>
-        <w:t>Ovo istraživanje polazi od temeljnog pitanja koja faktori određuju cijenu smještaja na Airbnb platformi, te da li ti faktori djeluju jednako u različitim urbanim sredinama. U fokusu su dva ključna prediktora: geografska lokacija smještaja unutar grada (centralni vs. periferni kvartovi) i tip smještaja (cijeli stan/kuća, privatna soba, zajednička soba).</w:t>
-      </w:r>
-      <w:r>
-        <w:t xml:space="preserve"> Analiza je provedena na uzorku od šest mediteranskih i južnoeuropskih gradova- Atena, Malaga, Istanbul, Napoli (Napulj), Rim, Valencia- koji dijele određene turističke karakteristike, ali se značajno razlikuju po veličini tržišta, ekonomskm kontekstu i turističkom pritisku.</w:t>
+        <w:t>I</w:t>
+      </w:r>
+      <w:r>
+        <w:t>straživanje polazi od temeljnog pitanja koj</w:t>
+      </w:r>
+      <w:r>
+        <w:t>i</w:t>
+      </w:r>
+      <w:r>
+        <w:t xml:space="preserve"> faktori određuju cijenu smještaja na Airbnb platformi, te da li ti faktori djeluju jednako u različitim urbanim sredinama. U fokusu su dva ključna prediktora: geografska lokacija smještaja unutar grada (centralni vs. periferni kvartovi) i tip smještaja (cijeli stan/kuća, privatna soba, zajednička soba).</w:t>
+      </w:r>
+      <w:r>
+        <w:t xml:space="preserve"> Analiza je provedena na uzorku od šest mediteranskih i južnoeuropskih gradova</w:t>
+      </w:r>
+      <w:r>
+        <w:t xml:space="preserve"> </w:t>
+      </w:r>
+      <w:r>
+        <w:t>- Atena, Malaga, Istanbul, Napulj, Rim, Valencia koji dijele određene turističke karakteristike, ali se značajno razlikuju po veličini tržišta, ekonomskm kontekstu i turističkom pritisku.</w:t>
       </w:r>
     </w:p>
     <w:p>
@@ -1602,7 +1593,32 @@
     </w:p>
     <w:p>
       <w:r>
-        <w:t>Iz ove hipoteze su proizašle tri pomoćne hippoteze koje se tastiraju kroz analizu:</w:t>
+        <w:t>Iz ove hipoteze su proizašle tri pomoćne hipoteze koje se t</w:t>
+      </w:r>
+      <w:r>
+        <w:t>e</w:t>
+      </w:r>
+      <w:r>
+        <w:t>stiraju kroz analizu:</w:t>
+      </w:r>
+    </w:p>
+    <w:p>
+      <w:pPr>
+        <w:pStyle w:val="ListParagraph"/>
+        <w:numPr>
+          <w:ilvl w:val="0"/>
+          <w:numId w:val="5"/>
+        </w:numPr>
+      </w:pPr>
+      <w:r>
+        <w:rPr>
+          <w:b/>
+          <w:bCs/>
+        </w:rPr>
+        <w:t xml:space="preserve">H1 - </w:t>
+      </w:r>
+      <w:r>
+        <w:t xml:space="preserve"> Smještaji u centralnim kvartovima imaju statistički višu prosječnu cijenu u odnosu na periferiju, no intenzitet ovog efekta varira po gradu. </w:t>
       </w:r>
     </w:p>
     <w:p>
@@ -1613,30 +1629,22 @@
           <w:numId w:val="5"/>
         </w:numPr>
         <w:rPr>
-          <w:lang w:val="en-US"/>
+          <w:lang w:val="pl-PL"/>
         </w:rPr>
       </w:pPr>
       <w:r>
         <w:rPr>
           <w:b/>
           <w:bCs/>
-          <w:lang w:val="en-US"/>
+          <w:lang w:val="pl-PL"/>
         </w:rPr>
-        <w:t>H</w:t>
+        <w:t>H2 -</w:t>
       </w:r>
       <w:r>
         <w:rPr>
-          <w:b/>
-          <w:bCs/>
-          <w:lang w:val="en-US"/>
+          <w:lang w:val="pl-PL"/>
         </w:rPr>
-        <w:t xml:space="preserve">1 - </w:t>
-      </w:r>
-      <w:r>
-        <w:rPr>
-          <w:lang w:val="en-US"/>
-        </w:rPr>
-        <w:t xml:space="preserve"> Smještaji u centralnim kvartovima imaju statistički višu prosječnu cijenu u odnosu na periferiju, no intenzitet ovog efekta varira po gradu. </w:t>
+        <w:t xml:space="preserve"> Iznajmljivanje cijelog stana nosi cjenovnu premiju u odnosu na privatnu sobu, no veličina premije ovisi o lokalnom tržišnom kontekstu. </w:t>
       </w:r>
     </w:p>
     <w:p>
@@ -1646,80 +1654,44 @@
           <w:ilvl w:val="0"/>
           <w:numId w:val="5"/>
         </w:numPr>
-        <w:rPr>
-          <w:lang w:val="en-US"/>
-        </w:rPr>
       </w:pPr>
       <w:r>
         <w:rPr>
           <w:b/>
           <w:bCs/>
-          <w:lang w:val="en-US"/>
+          <w:lang w:val="pl-PL"/>
         </w:rPr>
-        <w:t>H</w:t>
+        <w:t xml:space="preserve">H3 - </w:t>
       </w:r>
       <w:r>
         <w:rPr>
-          <w:b/>
-          <w:bCs/>
-          <w:lang w:val="en-US"/>
-        </w:rPr>
-        <w:t>2 -</w:t>
-      </w:r>
-      <w:r>
-        <w:rPr>
-          <w:lang w:val="en-US"/>
-        </w:rPr>
-        <w:t xml:space="preserve"> Iznajmljivanje cijelog stana nosi cjenovnu premiju u odnosu na privatnu sobu, no veličina premije ovisi o lokalnom tržišnom kontekstu. </w:t>
-      </w:r>
-    </w:p>
-    <w:p>
-      <w:pPr>
-        <w:pStyle w:val="ListParagraph"/>
-        <w:numPr>
-          <w:ilvl w:val="0"/>
-          <w:numId w:val="5"/>
-        </w:numPr>
-      </w:pPr>
-      <w:r>
-        <w:rPr>
-          <w:b/>
-          <w:bCs/>
-          <w:lang w:val="en-US"/>
-        </w:rPr>
-        <w:t>H</w:t>
-      </w:r>
-      <w:r>
-        <w:rPr>
-          <w:b/>
-          <w:bCs/>
-          <w:lang w:val="en-US"/>
-        </w:rPr>
-        <w:t xml:space="preserve">3 - </w:t>
-      </w:r>
-      <w:r>
-        <w:rPr>
-          <w:lang w:val="en-US"/>
+          <w:lang w:val="pl-PL"/>
         </w:rPr>
         <w:t>U gradovima s višim turističkim pritiskom lokacija dominira kao cjenovni faktor, dok u manjim tržištima tip smještaja postaje relativno važniji prediktor.</w:t>
       </w:r>
     </w:p>
     <w:p>
       <w:r>
-        <w:t xml:space="preserve">Cilj istraživanja nije samo potvrditi ili odbaciti ove hipoteze, već identificirati gradove i kvartove koji statistički odudaraju od očekivanih obrazaca </w:t>
+        <w:t xml:space="preserve">Cilj istraživanja </w:t>
+      </w:r>
+      <w:r>
+        <w:t>je</w:t>
+      </w:r>
+      <w:r>
+        <w:t xml:space="preserve"> identificirati gradove i kvartove koji statistički odudaraju od očekivanih obrazaca </w:t>
       </w:r>
       <w:r>
         <w:t>-</w:t>
       </w:r>
       <w:r>
-        <w:t xml:space="preserve"> čime se otvara prostor za dublje razumijevanje specifičnih lokalnih faktora koji oblikuju tržišta kratkoročnog iznajmljivanja. </w:t>
+        <w:t xml:space="preserve"> čime se otvara prostor za razumijevanje specifičnih lokalnih faktora koji oblikuju tržišta kratkoročnog iznajmljivanja. </w:t>
       </w:r>
     </w:p>
     <w:p>
       <w:pPr>
         <w:pStyle w:val="Heading1"/>
       </w:pPr>
-      <w:bookmarkStart w:id="1" w:name="_Toc230557948"/>
+      <w:bookmarkStart w:id="1" w:name="_Toc230624064"/>
       <w:r>
         <w:lastRenderedPageBreak/>
         <w:t>DATASET &amp; METODOLOGIJA</w:t>
@@ -1730,7 +1702,7 @@
       <w:pPr>
         <w:pStyle w:val="Heading2"/>
       </w:pPr>
-      <w:bookmarkStart w:id="2" w:name="_Toc230557949"/>
+      <w:bookmarkStart w:id="2" w:name="_Toc230624065"/>
       <w:r>
         <w:t>Izvori podataka</w:t>
       </w:r>
@@ -1738,7 +1710,18 @@
     </w:p>
     <w:p>
       <w:r>
-        <w:t>Istraživanje koristi podatke preuzete sa platforme Inside Airbnb (insideairbnb.com), neprofitnog projekta koji prikuplja i objavljuje javno dostupne podatke s Airbnb platforme u svrhu akademskih i istraživačkih analiza. Za svaki od šest garova korištena su dva tipa datoteka:</w:t>
+        <w:t>Istraživanje koristi podatke preuzete sa platforme Inside Airbnb (</w:t>
+      </w:r>
+      <w:hyperlink r:id="rId9" w:history="1">
+        <w:r>
+          <w:rPr>
+            <w:rStyle w:val="Hyperlink"/>
+          </w:rPr>
+          <w:t>insideairbnb.com</w:t>
+        </w:r>
+      </w:hyperlink>
+      <w:r>
+        <w:t>), neprofitnog projekta koji prikuplja i objavljuje javno dostupne podatke s Airbnb platforme u svrhu akademskih i istraživačkih analiza. Za svaki od šest garova korištena su dva tipa datoteka:</w:t>
       </w:r>
     </w:p>
     <w:p>
@@ -1750,7 +1733,13 @@
         </w:numPr>
       </w:pPr>
       <w:r>
-        <w:t xml:space="preserve">listing.csv </w:t>
+        <w:t>listing</w:t>
+      </w:r>
+      <w:r>
+        <w:t>s</w:t>
+      </w:r>
+      <w:r>
+        <w:t xml:space="preserve">.csv </w:t>
       </w:r>
       <w:r>
         <w:t>-</w:t>
@@ -1774,7 +1763,13 @@
         </w:numPr>
       </w:pPr>
       <w:r>
-        <w:t xml:space="preserve">neighbourhood.geojson </w:t>
+        <w:t>neighbourhood</w:t>
+      </w:r>
+      <w:r>
+        <w:t>s</w:t>
+      </w:r>
+      <w:r>
+        <w:t xml:space="preserve">.geojson </w:t>
       </w:r>
       <w:r>
         <w:t>-</w:t>
@@ -1960,7 +1955,7 @@
           </w:tcPr>
           <w:p>
             <w:r>
-              <w:t>Napoli</w:t>
+              <w:t>Napulj</w:t>
             </w:r>
           </w:p>
         </w:tc>
@@ -2078,7 +2073,7 @@
       <w:pPr>
         <w:pStyle w:val="Heading2"/>
       </w:pPr>
-      <w:bookmarkStart w:id="3" w:name="_Toc230557950"/>
+      <w:bookmarkStart w:id="3" w:name="_Toc230624066"/>
       <w:r>
         <w:t>Priprema i čišćenje podataka</w:t>
       </w:r>
@@ -2093,7 +2088,7 @@
       <w:pPr>
         <w:pStyle w:val="Heading2"/>
       </w:pPr>
-      <w:bookmarkStart w:id="4" w:name="_Toc230557951"/>
+      <w:bookmarkStart w:id="4" w:name="_Toc230624067"/>
       <w:r>
         <w:lastRenderedPageBreak/>
         <w:t>Metodološki pristup</w:t>
@@ -2265,21 +2260,14 @@
     </w:p>
     <w:p>
       <w:r>
-        <w:t>Sva analiza provedena je u programskom jeziku Python, korištenjem biblioteka Pandas i NumPy za manipulaciju podacima, Matplotlib i Seaborn za statističke vizualizacije, te Folium i Plotly za interaktivne geospacijalne prikaze.</w:t>
-      </w:r>
-    </w:p>
-    <w:p/>
-    <w:p/>
-    <w:p/>
-    <w:p/>
-    <w:p/>
-    <w:p/>
-    <w:p/>
+        <w:t>Sva analiza provedena je u programskom jeziku Python, korištenjem skupa specijaliziranih biblioteka odabranih prema zahtjevima svake analitičke faze. Manipulacija, čišćenje i transformacija podataka realizirane su putem biblioteka Pandas i NumPy, uključujući parsiranje cijena, filtriranje outliera IQR metodom te konverziju valuta u zajedničku USD bazu. Za statističke vizualizacije, uključujući histogram i KDE distribucije, boxplot i violin plot komparacije te scatter i regresijske dijagrame, korištene su biblioteke Matplotlib i Seaborn. Interaktivni geospacijalni prikazi u vidu choropleth heatmapa i trodimenzionalnih scatter mapa implementirani su putem biblioteka Folium i Plotly. Statistički testovi hipoteza, obuhvatajući jednosmjernu ANOVA-u, Kruskal-Wallis test te Pearson i Spearman korelacijske analize, provedeni su korištenjem biblioteke SciPy, dok je višestruka OLS regresija implementirana putem biblioteke Statsmodels. Segmentacija tržišnih segmenata metodom KMeans klasterizacije realizirana je putem biblioteke Scikit-learn, a izračun geodetske udaljenosti listinga od centra grada proveden je putem biblioteke Geopy.</w:t>
+      </w:r>
+    </w:p>
     <w:p>
       <w:pPr>
         <w:pStyle w:val="Heading1"/>
       </w:pPr>
-      <w:bookmarkStart w:id="5" w:name="_Toc230557952"/>
+      <w:bookmarkStart w:id="5" w:name="_Toc230624068"/>
       <w:r>
         <w:lastRenderedPageBreak/>
         <w:t>VIZUALIZACIJA PODATAKA</w:t>
@@ -2294,7 +2282,7 @@
           <w:lang w:val="bs-Latn-BA"/>
         </w:rPr>
       </w:pPr>
-      <w:bookmarkStart w:id="6" w:name="_Toc230557953"/>
+      <w:bookmarkStart w:id="6" w:name="_Toc230624069"/>
       <w:r>
         <w:t>Distribucija cijena po gradovima</w:t>
       </w:r>
@@ -2354,7 +2342,7 @@
                     </pic:cNvPicPr>
                   </pic:nvPicPr>
                   <pic:blipFill>
-                    <a:blip r:embed="rId9" cstate="print">
+                    <a:blip r:embed="rId10" cstate="print">
                       <a:extLst>
                         <a:ext uri="{28A0092B-C50C-407E-A947-70E740481C1C}">
                           <a14:useLocalDpi xmlns:a14="http://schemas.microsoft.com/office/drawing/2010/main" val="0"/>
@@ -2400,7 +2388,7 @@
       <w:pPr>
         <w:pStyle w:val="Heading2"/>
       </w:pPr>
-      <w:bookmarkStart w:id="7" w:name="_Toc230557954"/>
+      <w:bookmarkStart w:id="7" w:name="_Toc230624070"/>
       <w:r>
         <w:lastRenderedPageBreak/>
         <w:t>Geospacijalna analiza</w:t>
@@ -2479,7 +2467,7 @@
                     </pic:cNvPicPr>
                   </pic:nvPicPr>
                   <pic:blipFill>
-                    <a:blip r:embed="rId10" cstate="print">
+                    <a:blip r:embed="rId11" cstate="print">
                       <a:extLst>
                         <a:ext uri="{28A0092B-C50C-407E-A947-70E740481C1C}">
                           <a14:useLocalDpi xmlns:a14="http://schemas.microsoft.com/office/drawing/2010/main" val="0"/>
@@ -2532,7 +2520,7 @@
       <w:pPr>
         <w:pStyle w:val="Heading2"/>
       </w:pPr>
-      <w:bookmarkStart w:id="8" w:name="_Toc230557955"/>
+      <w:bookmarkStart w:id="8" w:name="_Toc230624071"/>
       <w:r>
         <w:lastRenderedPageBreak/>
         <w:t>Analiza tipa smještaja i komparacija gradova</w:t>
@@ -2587,7 +2575,7 @@
                     </pic:cNvPicPr>
                   </pic:nvPicPr>
                   <pic:blipFill>
-                    <a:blip r:embed="rId11" cstate="print">
+                    <a:blip r:embed="rId12" cstate="print">
                       <a:extLst>
                         <a:ext uri="{28A0092B-C50C-407E-A947-70E740481C1C}">
                           <a14:useLocalDpi xmlns:a14="http://schemas.microsoft.com/office/drawing/2010/main" val="0"/>
@@ -2633,7 +2621,7 @@
       <w:pPr>
         <w:pStyle w:val="Heading2"/>
       </w:pPr>
-      <w:bookmarkStart w:id="9" w:name="_Toc230557956"/>
+      <w:bookmarkStart w:id="9" w:name="_Toc230624072"/>
       <w:r>
         <w:lastRenderedPageBreak/>
         <w:t>Analiza hostova</w:t>
@@ -2653,7 +2641,13 @@
         <w:t>-</w:t>
       </w:r>
       <w:r>
-        <w:t>15%), no nije primarni cjenovni driver. Komercijalni hostovi (20+ listinga) naplaćuju tek ~6 USD više od privatnih (~112 vs. ~118 USD), što govori da tržišna konkurencija ograničava njihovu cjenovnu moć. Zanimljiv nalaz je i da smještaji s instant rezervacijom imaju višu prosječnu cijenu, ali nižu prosječnu ocjenu gostiju.</w:t>
+        <w:t xml:space="preserve">15%), no </w:t>
+      </w:r>
+      <w:r>
+        <w:t>ne predstavlja primarni uticaj na cijenu</w:t>
+      </w:r>
+      <w:r>
+        <w:t>. Komercijalni hostovi (20+ listinga) naplaćuju tek ~6 USD više od privatnih (~112 vs. ~118 USD), što govori da tržišna konkurencija ograničava njihovu cjenovnu moć. Zanimljiv nalaz je i da smještaji s instant rezervacijom imaju višu prosječnu cijenu, ali nižu prosječnu ocjenu gostiju.</w:t>
       </w:r>
     </w:p>
     <w:p>
@@ -2684,7 +2678,7 @@
                     </pic:cNvPicPr>
                   </pic:nvPicPr>
                   <pic:blipFill>
-                    <a:blip r:embed="rId12" cstate="print">
+                    <a:blip r:embed="rId13" cstate="print">
                       <a:extLst>
                         <a:ext uri="{28A0092B-C50C-407E-A947-70E740481C1C}">
                           <a14:useLocalDpi xmlns:a14="http://schemas.microsoft.com/office/drawing/2010/main" val="0"/>
@@ -2751,7 +2745,7 @@
       <w:pPr>
         <w:pStyle w:val="Heading2"/>
       </w:pPr>
-      <w:bookmarkStart w:id="10" w:name="_Toc230557957"/>
+      <w:bookmarkStart w:id="10" w:name="_Toc230624073"/>
       <w:r>
         <w:lastRenderedPageBreak/>
         <w:t>Recenzije i ocjene</w:t>
@@ -2820,7 +2814,7 @@
                     </pic:cNvPicPr>
                   </pic:nvPicPr>
                   <pic:blipFill>
-                    <a:blip r:embed="rId13" cstate="print">
+                    <a:blip r:embed="rId14" cstate="print">
                       <a:extLst>
                         <a:ext uri="{28A0092B-C50C-407E-A947-70E740481C1C}">
                           <a14:useLocalDpi xmlns:a14="http://schemas.microsoft.com/office/drawing/2010/main" val="0"/>
@@ -2869,7 +2863,7 @@
       <w:pPr>
         <w:pStyle w:val="Heading2"/>
       </w:pPr>
-      <w:bookmarkStart w:id="11" w:name="_Toc230557958"/>
+      <w:bookmarkStart w:id="11" w:name="_Toc230624074"/>
       <w:r>
         <w:lastRenderedPageBreak/>
         <w:t>Regresijska analiza - lokacija vs. tip smještaja</w:t>
@@ -2931,7 +2925,7 @@
                     </pic:cNvPicPr>
                   </pic:nvPicPr>
                   <pic:blipFill>
-                    <a:blip r:embed="rId14" cstate="print">
+                    <a:blip r:embed="rId15" cstate="print">
                       <a:extLst>
                         <a:ext uri="{28A0092B-C50C-407E-A947-70E740481C1C}">
                           <a14:useLocalDpi xmlns:a14="http://schemas.microsoft.com/office/drawing/2010/main" val="0"/>
@@ -2995,7 +2989,7 @@
       <w:pPr>
         <w:pStyle w:val="Heading2"/>
       </w:pPr>
-      <w:bookmarkStart w:id="12" w:name="_Toc230557959"/>
+      <w:bookmarkStart w:id="12" w:name="_Toc230624075"/>
       <w:r>
         <w:lastRenderedPageBreak/>
         <w:t>Napredna analiza</w:t>
@@ -3009,7 +3003,19 @@
         <w:jc w:val="both"/>
       </w:pPr>
       <w:r>
-        <w:t>KMeans klasterizacija (K=4) identificira četiri tržišna segmenta: centralni premium, standardni centralni, periferni ekonomični i atipični periferijski outlieri s visokim cijenama. Analiza amenities otkriva da hair dryer (~26 USD), bed linens (~18 USD) i vatrogasni aparat (~18 USD) nose najveće cjenovne premije, dok WiFi (~7 USD) više nije distinktivni faktor zbog opće rasprostranjenosti.</w:t>
+        <w:t xml:space="preserve">KMeans klasterizacija (K=4) identificira četiri tržišna segmenta: centralni premium, standardni centralni, periferni ekonomični i atipični periferijski outlieri s visokim cijenama. Analiza amenities otkriva da </w:t>
+      </w:r>
+      <w:r>
+        <w:t>fen za kosu</w:t>
+      </w:r>
+      <w:r>
+        <w:t xml:space="preserve"> (~26 USD), </w:t>
+      </w:r>
+      <w:r>
+        <w:t>posteljina</w:t>
+      </w:r>
+      <w:r>
+        <w:t xml:space="preserve"> (~18 USD) i vatrogasni aparat (~18 USD) nose najveće cjenovne premije, dok WiFi (~7 USD) više nije distinktivni faktor zbog opće rasprostranjenosti.</w:t>
       </w:r>
     </w:p>
     <w:p>
@@ -3045,7 +3051,7 @@
                     </pic:cNvPicPr>
                   </pic:nvPicPr>
                   <pic:blipFill>
-                    <a:blip r:embed="rId15" cstate="print">
+                    <a:blip r:embed="rId16" cstate="print">
                       <a:extLst>
                         <a:ext uri="{28A0092B-C50C-407E-A947-70E740481C1C}">
                           <a14:useLocalDpi xmlns:a14="http://schemas.microsoft.com/office/drawing/2010/main" val="0"/>
@@ -3097,7 +3103,7 @@
       <w:pPr>
         <w:pStyle w:val="Heading1"/>
       </w:pPr>
-      <w:bookmarkStart w:id="13" w:name="_Toc230557960"/>
+      <w:bookmarkStart w:id="13" w:name="_Toc230624076"/>
       <w:r>
         <w:lastRenderedPageBreak/>
         <w:t>ZAKLJUČAK</w:t>
@@ -3128,7 +3134,19 @@
         <w:t>H0 - POTVRĐENA.</w:t>
       </w:r>
       <w:r>
-        <w:t xml:space="preserve"> Cijena smještaja je determinirana kombinacijom lokacije i tipa smještaja, a relativna važnost ovih faktora se sistematski razlikuje između gradova. Regresijska analiza potvrđuje ovu vezu kao statistički značajnu u svim šest tržišta.</w:t>
+        <w:t xml:space="preserve"> Cijena smještaja je determinirana kombinacijom lokacije i tipa smještaja, </w:t>
+      </w:r>
+      <w:r>
+        <w:t>dok</w:t>
+      </w:r>
+      <w:r>
+        <w:t xml:space="preserve"> relativna važnost ovih faktora se sistematski razlikuje između gradova. Regresijska analiza potvrđuje ovu vezu kao statistički značajnu u svi</w:t>
+      </w:r>
+      <w:r>
+        <w:t>h</w:t>
+      </w:r>
+      <w:r>
+        <w:t xml:space="preserve"> šest tržišta.</w:t>
       </w:r>
     </w:p>
     <w:p>
@@ -3169,7 +3187,13 @@
         <w:t xml:space="preserve"> -</w:t>
       </w:r>
       <w:r>
-        <w:t>0,04), što ukazuje da H1 vrijedi kao generalni trend, ali ne kao universalni zakon.</w:t>
+        <w:t>0,04), što ukazuje da H1 vrijedi kao generalni trend, ali ne kao univer</w:t>
+      </w:r>
+      <w:r>
+        <w:t>z</w:t>
+      </w:r>
+      <w:r>
+        <w:t>alni zakon.</w:t>
       </w:r>
     </w:p>
     <w:p>
@@ -3186,7 +3210,13 @@
         <w:t>H2 - POTVRĐENA.</w:t>
       </w:r>
       <w:r>
-        <w:t xml:space="preserve"> Cijeli stan dosljedno postiže višu cijenu od privatne sobe u svim šest gradova, s regresijski potvrđenom i statistički značajnom premiom koja varira po tržištu.</w:t>
+        <w:t xml:space="preserve"> Cijeli stan dosljedno postiže višu cijenu od privatne sobe u svi</w:t>
+      </w:r>
+      <w:r>
+        <w:t>h</w:t>
+      </w:r>
+      <w:r>
+        <w:t xml:space="preserve"> šest gradova, s regresijski potvrđenom i statistički značajnom premiom koja varira po tržištu.</w:t>
       </w:r>
     </w:p>
     <w:p>
@@ -3219,24 +3249,31 @@
         <w:t>-</w:t>
       </w:r>
       <w:r>
-        <w:t>oktobar 2025.) i ne zahvataju sezonske varijacije, a objavljene cijene ne moraju odgovarati realiziranim cijenama rezervacija. Buduća istraživanja mogla bi uključiti longitudinalnu analizu, podatke o popunjenosti te komparaciju s hotelskim tržištem.</w:t>
-      </w:r>
-    </w:p>
-    <w:p/>
-    <w:p/>
-    <w:p/>
-    <w:p/>
-    <w:p/>
+        <w:t>oktobar 2025.) i ne zahvataju sezonske varijacije, a objavljene cijene ne moraju odgovarati realiziranim cijenama rezervacija. Buduća istraživanja mogla bi uključiti longitudinalnu analizu, podatke o popunjenosti</w:t>
+      </w:r>
+      <w:r>
+        <w:t xml:space="preserve">, </w:t>
+      </w:r>
+      <w:r>
+        <w:t>te komparaciju s hotelskim tržištem.</w:t>
+      </w:r>
+      <w:r>
+        <w:br w:type="page"/>
+      </w:r>
+    </w:p>
     <w:p>
       <w:pPr>
         <w:pStyle w:val="Heading4"/>
       </w:pPr>
-      <w:r>
+      <w:bookmarkStart w:id="14" w:name="_Toc230624077"/>
+      <w:r>
+        <w:lastRenderedPageBreak/>
         <w:t>LITERATUR</w:t>
       </w:r>
       <w:r>
         <w:t>A</w:t>
       </w:r>
+      <w:bookmarkEnd w:id="14"/>
     </w:p>
     <w:p>
       <w:r>
@@ -3252,7 +3289,7 @@
       <w:r>
         <w:t xml:space="preserve"> [Skup podataka za gradove: Atena (26.09.2025.), Malaga (30.09.2025.), Istanbul (29.09.2025.), Napulj (22.09.2025.), Rim (14.09.2025.) i Valencia (23.09.2025.)]. Preuzeto sa zvanične platforme Inside Airbnb: </w:t>
       </w:r>
-      <w:hyperlink r:id="rId16" w:tgtFrame="_blank" w:history="1">
+      <w:hyperlink r:id="rId17" w:tgtFrame="_blank" w:history="1">
         <w:r>
           <w:rPr>
             <w:rStyle w:val="Hyperlink"/>
@@ -3265,7 +3302,7 @@
       </w:r>
     </w:p>
     <w:sectPr>
-      <w:footerReference w:type="default" r:id="rId17"/>
+      <w:footerReference w:type="default" r:id="rId18"/>
       <w:pgSz w:w="12240" w:h="15840"/>
       <w:pgMar w:top="1440" w:right="1440" w:bottom="1440" w:left="1440" w:header="720" w:footer="720" w:gutter="0"/>
       <w:pgNumType w:start="1"/>
@@ -3277,7 +3314,7 @@
 </file>
 
 <file path=word/endnotes.xml><?xml version="1.0" encoding="utf-8"?>
-<w:endnotes xmlns:wpc="http://schemas.microsoft.com/office/word/2010/wordprocessingCanvas" xmlns:cx="http://schemas.microsoft.com/office/drawing/2014/chartex" xmlns:cx1="http://schemas.microsoft.com/office/drawing/2015/9/8/chartex" xmlns:cx2="http://schemas.microsoft.com/office/drawing/2015/10/21/chartex" xmlns:cx3="http://schemas.microsoft.com/office/drawing/2016/5/9/chartex" xmlns:cx4="http://schemas.microsoft.com/office/drawing/2016/5/10/chartex" xmlns:cx5="http://schemas.microsoft.com/office/drawing/2016/5/11/chartex" xmlns:cx6="http://schemas.microsoft.com/office/drawing/2016/5/12/chartex" xmlns:cx7="http://schemas.microsoft.com/office/drawing/2016/5/13/chartex" xmlns:cx8="http://schemas.microsoft.com/office/drawing/2016/5/14/chartex" xmlns:mc="http://schemas.openxmlformats.org/markup-compatibility/2006" xmlns:aink="http://schemas.microsoft.com/office/drawing/2016/ink" xmlns:am3d="http://schemas.microsoft.com/office/drawing/2017/model3d" xmlns:o="urn:schemas-microsoft-com:office:office" xmlns:r="http://schemas.openxmlformats.org/officeDocument/2006/relationships" xmlns:m="http://schemas.openxmlformats.org/officeDocument/2006/math" xmlns:v="urn:schemas-microsoft-com:vml" xmlns:wp14="http://schemas.microsoft.com/office/word/2010/wordprocessingDrawing" xmlns:wp="http://schemas.openxmlformats.org/drawingml/2006/wordprocessingDrawing" xmlns:w10="urn:schemas-microsoft-com:office:word" xmlns:w="http://schemas.openxmlformats.org/wordprocessingml/2006/main" xmlns:w14="http://schemas.microsoft.com/office/word/2010/wordml" xmlns:w15="http://schemas.microsoft.com/office/word/2012/wordml" xmlns:w16cex="http://schemas.microsoft.com/office/word/2018/wordml/cex" xmlns:w16cid="http://schemas.microsoft.com/office/word/2016/wordml/cid" xmlns:w16="http://schemas.microsoft.com/office/word/2018/wordml" xmlns:w16sdtdh="http://schemas.microsoft.com/office/word/2020/wordml/sdtdatahash" xmlns:w16se="http://schemas.microsoft.com/office/word/2015/wordml/symex" xmlns:wpg="http://schemas.microsoft.com/office/word/2010/wordprocessingGroup" xmlns:wpi="http://schemas.microsoft.com/office/word/2010/wordprocessingInk" xmlns:wne="http://schemas.microsoft.com/office/word/2006/wordml" xmlns:wps="http://schemas.microsoft.com/office/word/2010/wordprocessingShape" mc:Ignorable="w14 w15 w16se w16cid w16 w16cex w16sdtdh wp14">
+<w:endnotes xmlns:wpc="http://schemas.microsoft.com/office/word/2010/wordprocessingCanvas" xmlns:cx="http://schemas.microsoft.com/office/drawing/2014/chartex" xmlns:cx1="http://schemas.microsoft.com/office/drawing/2015/9/8/chartex" xmlns:cx2="http://schemas.microsoft.com/office/drawing/2015/10/21/chartex" xmlns:cx3="http://schemas.microsoft.com/office/drawing/2016/5/9/chartex" xmlns:cx4="http://schemas.microsoft.com/office/drawing/2016/5/10/chartex" xmlns:cx5="http://schemas.microsoft.com/office/drawing/2016/5/11/chartex" xmlns:cx6="http://schemas.microsoft.com/office/drawing/2016/5/12/chartex" xmlns:cx7="http://schemas.microsoft.com/office/drawing/2016/5/13/chartex" xmlns:cx8="http://schemas.microsoft.com/office/drawing/2016/5/14/chartex" xmlns:mc="http://schemas.openxmlformats.org/markup-compatibility/2006" xmlns:aink="http://schemas.microsoft.com/office/drawing/2016/ink" xmlns:am3d="http://schemas.microsoft.com/office/drawing/2017/model3d" xmlns:o="urn:schemas-microsoft-com:office:office" xmlns:oel="http://schemas.microsoft.com/office/2019/extlst" xmlns:r="http://schemas.openxmlformats.org/officeDocument/2006/relationships" xmlns:m="http://schemas.openxmlformats.org/officeDocument/2006/math" xmlns:v="urn:schemas-microsoft-com:vml" xmlns:wp14="http://schemas.microsoft.com/office/word/2010/wordprocessingDrawing" xmlns:wp="http://schemas.openxmlformats.org/drawingml/2006/wordprocessingDrawing" xmlns:w10="urn:schemas-microsoft-com:office:word" xmlns:w="http://schemas.openxmlformats.org/wordprocessingml/2006/main" xmlns:w14="http://schemas.microsoft.com/office/word/2010/wordml" xmlns:w15="http://schemas.microsoft.com/office/word/2012/wordml" xmlns:w16cex="http://schemas.microsoft.com/office/word/2018/wordml/cex" xmlns:w16cid="http://schemas.microsoft.com/office/word/2016/wordml/cid" xmlns:w16="http://schemas.microsoft.com/office/word/2018/wordml" xmlns:w16du="http://schemas.microsoft.com/office/word/2023/wordml/word16du" xmlns:w16sdtdh="http://schemas.microsoft.com/office/word/2020/wordml/sdtdatahash" xmlns:w16sdtfl="http://schemas.microsoft.com/office/word/2024/wordml/sdtformatlock" xmlns:w16se="http://schemas.microsoft.com/office/word/2015/wordml/symex" xmlns:wpg="http://schemas.microsoft.com/office/word/2010/wordprocessingGroup" xmlns:wpi="http://schemas.microsoft.com/office/word/2010/wordprocessingInk" xmlns:wne="http://schemas.microsoft.com/office/word/2006/wordml" xmlns:wps="http://schemas.microsoft.com/office/word/2010/wordprocessingShape" mc:Ignorable="w14 w15 w16se w16cid w16 w16cex w16sdtdh w16sdtfl w16du wp14">
   <w:endnote w:type="separator" w:id="-1">
     <w:p>
       <w:pPr>
@@ -3302,7 +3339,7 @@
 </file>
 
 <file path=word/footer1.xml><?xml version="1.0" encoding="utf-8"?>
-<w:ftr xmlns:wpc="http://schemas.microsoft.com/office/word/2010/wordprocessingCanvas" xmlns:cx="http://schemas.microsoft.com/office/drawing/2014/chartex" xmlns:cx1="http://schemas.microsoft.com/office/drawing/2015/9/8/chartex" xmlns:cx2="http://schemas.microsoft.com/office/drawing/2015/10/21/chartex" xmlns:cx3="http://schemas.microsoft.com/office/drawing/2016/5/9/chartex" xmlns:cx4="http://schemas.microsoft.com/office/drawing/2016/5/10/chartex" xmlns:cx5="http://schemas.microsoft.com/office/drawing/2016/5/11/chartex" xmlns:cx6="http://schemas.microsoft.com/office/drawing/2016/5/12/chartex" xmlns:cx7="http://schemas.microsoft.com/office/drawing/2016/5/13/chartex" xmlns:cx8="http://schemas.microsoft.com/office/drawing/2016/5/14/chartex" xmlns:mc="http://schemas.openxmlformats.org/markup-compatibility/2006" xmlns:aink="http://schemas.microsoft.com/office/drawing/2016/ink" xmlns:am3d="http://schemas.microsoft.com/office/drawing/2017/model3d" xmlns:o="urn:schemas-microsoft-com:office:office" xmlns:r="http://schemas.openxmlformats.org/officeDocument/2006/relationships" xmlns:m="http://schemas.openxmlformats.org/officeDocument/2006/math" xmlns:v="urn:schemas-microsoft-com:vml" xmlns:wp14="http://schemas.microsoft.com/office/word/2010/wordprocessingDrawing" xmlns:wp="http://schemas.openxmlformats.org/drawingml/2006/wordprocessingDrawing" xmlns:w10="urn:schemas-microsoft-com:office:word" xmlns:w="http://schemas.openxmlformats.org/wordprocessingml/2006/main" xmlns:w14="http://schemas.microsoft.com/office/word/2010/wordml" xmlns:w15="http://schemas.microsoft.com/office/word/2012/wordml" xmlns:w16cex="http://schemas.microsoft.com/office/word/2018/wordml/cex" xmlns:w16cid="http://schemas.microsoft.com/office/word/2016/wordml/cid" xmlns:w16="http://schemas.microsoft.com/office/word/2018/wordml" xmlns:w16sdtdh="http://schemas.microsoft.com/office/word/2020/wordml/sdtdatahash" xmlns:w16se="http://schemas.microsoft.com/office/word/2015/wordml/symex" xmlns:wpg="http://schemas.microsoft.com/office/word/2010/wordprocessingGroup" xmlns:wpi="http://schemas.microsoft.com/office/word/2010/wordprocessingInk" xmlns:wne="http://schemas.microsoft.com/office/word/2006/wordml" xmlns:wps="http://schemas.microsoft.com/office/word/2010/wordprocessingShape" mc:Ignorable="w14 w15 w16se w16cid w16 w16cex w16sdtdh wp14">
+<w:ftr xmlns:wpc="http://schemas.microsoft.com/office/word/2010/wordprocessingCanvas" xmlns:cx="http://schemas.microsoft.com/office/drawing/2014/chartex" xmlns:cx1="http://schemas.microsoft.com/office/drawing/2015/9/8/chartex" xmlns:cx2="http://schemas.microsoft.com/office/drawing/2015/10/21/chartex" xmlns:cx3="http://schemas.microsoft.com/office/drawing/2016/5/9/chartex" xmlns:cx4="http://schemas.microsoft.com/office/drawing/2016/5/10/chartex" xmlns:cx5="http://schemas.microsoft.com/office/drawing/2016/5/11/chartex" xmlns:cx6="http://schemas.microsoft.com/office/drawing/2016/5/12/chartex" xmlns:cx7="http://schemas.microsoft.com/office/drawing/2016/5/13/chartex" xmlns:cx8="http://schemas.microsoft.com/office/drawing/2016/5/14/chartex" xmlns:mc="http://schemas.openxmlformats.org/markup-compatibility/2006" xmlns:aink="http://schemas.microsoft.com/office/drawing/2016/ink" xmlns:am3d="http://schemas.microsoft.com/office/drawing/2017/model3d" xmlns:o="urn:schemas-microsoft-com:office:office" xmlns:oel="http://schemas.microsoft.com/office/2019/extlst" xmlns:r="http://schemas.openxmlformats.org/officeDocument/2006/relationships" xmlns:m="http://schemas.openxmlformats.org/officeDocument/2006/math" xmlns:v="urn:schemas-microsoft-com:vml" xmlns:wp14="http://schemas.microsoft.com/office/word/2010/wordprocessingDrawing" xmlns:wp="http://schemas.openxmlformats.org/drawingml/2006/wordprocessingDrawing" xmlns:w10="urn:schemas-microsoft-com:office:word" xmlns:w="http://schemas.openxmlformats.org/wordprocessingml/2006/main" xmlns:w14="http://schemas.microsoft.com/office/word/2010/wordml" xmlns:w15="http://schemas.microsoft.com/office/word/2012/wordml" xmlns:w16cex="http://schemas.microsoft.com/office/word/2018/wordml/cex" xmlns:w16cid="http://schemas.microsoft.com/office/word/2016/wordml/cid" xmlns:w16="http://schemas.microsoft.com/office/word/2018/wordml" xmlns:w16du="http://schemas.microsoft.com/office/word/2023/wordml/word16du" xmlns:w16sdtdh="http://schemas.microsoft.com/office/word/2020/wordml/sdtdatahash" xmlns:w16sdtfl="http://schemas.microsoft.com/office/word/2024/wordml/sdtformatlock" xmlns:w16se="http://schemas.microsoft.com/office/word/2015/wordml/symex" xmlns:wpg="http://schemas.microsoft.com/office/word/2010/wordprocessingGroup" xmlns:wpi="http://schemas.microsoft.com/office/word/2010/wordprocessingInk" xmlns:wne="http://schemas.microsoft.com/office/word/2006/wordml" xmlns:wps="http://schemas.microsoft.com/office/word/2010/wordprocessingShape" mc:Ignorable="w14 w15 w16se w16cid w16 w16cex w16sdtdh w16sdtfl w16du wp14">
   <w:p>
     <w:pPr>
       <w:pStyle w:val="Footer"/>
@@ -3318,7 +3355,7 @@
 </file>
 
 <file path=word/footer2.xml><?xml version="1.0" encoding="utf-8"?>
-<w:ftr xmlns:wpc="http://schemas.microsoft.com/office/word/2010/wordprocessingCanvas" xmlns:cx="http://schemas.microsoft.com/office/drawing/2014/chartex" xmlns:cx1="http://schemas.microsoft.com/office/drawing/2015/9/8/chartex" xmlns:cx2="http://schemas.microsoft.com/office/drawing/2015/10/21/chartex" xmlns:cx3="http://schemas.microsoft.com/office/drawing/2016/5/9/chartex" xmlns:cx4="http://schemas.microsoft.com/office/drawing/2016/5/10/chartex" xmlns:cx5="http://schemas.microsoft.com/office/drawing/2016/5/11/chartex" xmlns:cx6="http://schemas.microsoft.com/office/drawing/2016/5/12/chartex" xmlns:cx7="http://schemas.microsoft.com/office/drawing/2016/5/13/chartex" xmlns:cx8="http://schemas.microsoft.com/office/drawing/2016/5/14/chartex" xmlns:mc="http://schemas.openxmlformats.org/markup-compatibility/2006" xmlns:aink="http://schemas.microsoft.com/office/drawing/2016/ink" xmlns:am3d="http://schemas.microsoft.com/office/drawing/2017/model3d" xmlns:o="urn:schemas-microsoft-com:office:office" xmlns:r="http://schemas.openxmlformats.org/officeDocument/2006/relationships" xmlns:m="http://schemas.openxmlformats.org/officeDocument/2006/math" xmlns:v="urn:schemas-microsoft-com:vml" xmlns:wp14="http://schemas.microsoft.com/office/word/2010/wordprocessingDrawing" xmlns:wp="http://schemas.openxmlformats.org/drawingml/2006/wordprocessingDrawing" xmlns:w10="urn:schemas-microsoft-com:office:word" xmlns:w="http://schemas.openxmlformats.org/wordprocessingml/2006/main" xmlns:w14="http://schemas.microsoft.com/office/word/2010/wordml" xmlns:w15="http://schemas.microsoft.com/office/word/2012/wordml" xmlns:w16cex="http://schemas.microsoft.com/office/word/2018/wordml/cex" xmlns:w16cid="http://schemas.microsoft.com/office/word/2016/wordml/cid" xmlns:w16="http://schemas.microsoft.com/office/word/2018/wordml" xmlns:w16sdtdh="http://schemas.microsoft.com/office/word/2020/wordml/sdtdatahash" xmlns:w16se="http://schemas.microsoft.com/office/word/2015/wordml/symex" xmlns:wpg="http://schemas.microsoft.com/office/word/2010/wordprocessingGroup" xmlns:wpi="http://schemas.microsoft.com/office/word/2010/wordprocessingInk" xmlns:wne="http://schemas.microsoft.com/office/word/2006/wordml" xmlns:wps="http://schemas.microsoft.com/office/word/2010/wordprocessingShape" mc:Ignorable="w14 w15 w16se w16cid w16 w16cex w16sdtdh wp14">
+<w:ftr xmlns:wpc="http://schemas.microsoft.com/office/word/2010/wordprocessingCanvas" xmlns:cx="http://schemas.microsoft.com/office/drawing/2014/chartex" xmlns:cx1="http://schemas.microsoft.com/office/drawing/2015/9/8/chartex" xmlns:cx2="http://schemas.microsoft.com/office/drawing/2015/10/21/chartex" xmlns:cx3="http://schemas.microsoft.com/office/drawing/2016/5/9/chartex" xmlns:cx4="http://schemas.microsoft.com/office/drawing/2016/5/10/chartex" xmlns:cx5="http://schemas.microsoft.com/office/drawing/2016/5/11/chartex" xmlns:cx6="http://schemas.microsoft.com/office/drawing/2016/5/12/chartex" xmlns:cx7="http://schemas.microsoft.com/office/drawing/2016/5/13/chartex" xmlns:cx8="http://schemas.microsoft.com/office/drawing/2016/5/14/chartex" xmlns:mc="http://schemas.openxmlformats.org/markup-compatibility/2006" xmlns:aink="http://schemas.microsoft.com/office/drawing/2016/ink" xmlns:am3d="http://schemas.microsoft.com/office/drawing/2017/model3d" xmlns:o="urn:schemas-microsoft-com:office:office" xmlns:oel="http://schemas.microsoft.com/office/2019/extlst" xmlns:r="http://schemas.openxmlformats.org/officeDocument/2006/relationships" xmlns:m="http://schemas.openxmlformats.org/officeDocument/2006/math" xmlns:v="urn:schemas-microsoft-com:vml" xmlns:wp14="http://schemas.microsoft.com/office/word/2010/wordprocessingDrawing" xmlns:wp="http://schemas.openxmlformats.org/drawingml/2006/wordprocessingDrawing" xmlns:w10="urn:schemas-microsoft-com:office:word" xmlns:w="http://schemas.openxmlformats.org/wordprocessingml/2006/main" xmlns:w14="http://schemas.microsoft.com/office/word/2010/wordml" xmlns:w15="http://schemas.microsoft.com/office/word/2012/wordml" xmlns:w16cex="http://schemas.microsoft.com/office/word/2018/wordml/cex" xmlns:w16cid="http://schemas.microsoft.com/office/word/2016/wordml/cid" xmlns:w16="http://schemas.microsoft.com/office/word/2018/wordml" xmlns:w16du="http://schemas.microsoft.com/office/word/2023/wordml/word16du" xmlns:w16sdtdh="http://schemas.microsoft.com/office/word/2020/wordml/sdtdatahash" xmlns:w16sdtfl="http://schemas.microsoft.com/office/word/2024/wordml/sdtformatlock" xmlns:w16se="http://schemas.microsoft.com/office/word/2015/wordml/symex" xmlns:wpg="http://schemas.microsoft.com/office/word/2010/wordprocessingGroup" xmlns:wpi="http://schemas.microsoft.com/office/word/2010/wordprocessingInk" xmlns:wne="http://schemas.microsoft.com/office/word/2006/wordml" xmlns:wps="http://schemas.microsoft.com/office/word/2010/wordprocessingShape" mc:Ignorable="w14 w15 w16se w16cid w16 w16cex w16sdtdh w16sdtfl w16du wp14">
   <w:sdt>
     <w:sdtPr>
       <w:id w:val="-272710508"/>
@@ -3327,7 +3364,6 @@
         <w:docPartUnique/>
       </w:docPartObj>
     </w:sdtPr>
-    <w:sdtEndPr/>
     <w:sdtContent>
       <w:p>
         <w:pPr>
@@ -3361,7 +3397,7 @@
 </file>
 
 <file path=word/footnotes.xml><?xml version="1.0" encoding="utf-8"?>
-<w:footnotes xmlns:wpc="http://schemas.microsoft.com/office/word/2010/wordprocessingCanvas" xmlns:cx="http://schemas.microsoft.com/office/drawing/2014/chartex" xmlns:cx1="http://schemas.microsoft.com/office/drawing/2015/9/8/chartex" xmlns:cx2="http://schemas.microsoft.com/office/drawing/2015/10/21/chartex" xmlns:cx3="http://schemas.microsoft.com/office/drawing/2016/5/9/chartex" xmlns:cx4="http://schemas.microsoft.com/office/drawing/2016/5/10/chartex" xmlns:cx5="http://schemas.microsoft.com/office/drawing/2016/5/11/chartex" xmlns:cx6="http://schemas.microsoft.com/office/drawing/2016/5/12/chartex" xmlns:cx7="http://schemas.microsoft.com/office/drawing/2016/5/13/chartex" xmlns:cx8="http://schemas.microsoft.com/office/drawing/2016/5/14/chartex" xmlns:mc="http://schemas.openxmlformats.org/markup-compatibility/2006" xmlns:aink="http://schemas.microsoft.com/office/drawing/2016/ink" xmlns:am3d="http://schemas.microsoft.com/office/drawing/2017/model3d" xmlns:o="urn:schemas-microsoft-com:office:office" xmlns:r="http://schemas.openxmlformats.org/officeDocument/2006/relationships" xmlns:m="http://schemas.openxmlformats.org/officeDocument/2006/math" xmlns:v="urn:schemas-microsoft-com:vml" xmlns:wp14="http://schemas.microsoft.com/office/word/2010/wordprocessingDrawing" xmlns:wp="http://schemas.openxmlformats.org/drawingml/2006/wordprocessingDrawing" xmlns:w10="urn:schemas-microsoft-com:office:word" xmlns:w="http://schemas.openxmlformats.org/wordprocessingml/2006/main" xmlns:w14="http://schemas.microsoft.com/office/word/2010/wordml" xmlns:w15="http://schemas.microsoft.com/office/word/2012/wordml" xmlns:w16cex="http://schemas.microsoft.com/office/word/2018/wordml/cex" xmlns:w16cid="http://schemas.microsoft.com/office/word/2016/wordml/cid" xmlns:w16="http://schemas.microsoft.com/office/word/2018/wordml" xmlns:w16sdtdh="http://schemas.microsoft.com/office/word/2020/wordml/sdtdatahash" xmlns:w16se="http://schemas.microsoft.com/office/word/2015/wordml/symex" xmlns:wpg="http://schemas.microsoft.com/office/word/2010/wordprocessingGroup" xmlns:wpi="http://schemas.microsoft.com/office/word/2010/wordprocessingInk" xmlns:wne="http://schemas.microsoft.com/office/word/2006/wordml" xmlns:wps="http://schemas.microsoft.com/office/word/2010/wordprocessingShape" mc:Ignorable="w14 w15 w16se w16cid w16 w16cex w16sdtdh wp14">
+<w:footnotes xmlns:wpc="http://schemas.microsoft.com/office/word/2010/wordprocessingCanvas" xmlns:cx="http://schemas.microsoft.com/office/drawing/2014/chartex" xmlns:cx1="http://schemas.microsoft.com/office/drawing/2015/9/8/chartex" xmlns:cx2="http://schemas.microsoft.com/office/drawing/2015/10/21/chartex" xmlns:cx3="http://schemas.microsoft.com/office/drawing/2016/5/9/chartex" xmlns:cx4="http://schemas.microsoft.com/office/drawing/2016/5/10/chartex" xmlns:cx5="http://schemas.microsoft.com/office/drawing/2016/5/11/chartex" xmlns:cx6="http://schemas.microsoft.com/office/drawing/2016/5/12/chartex" xmlns:cx7="http://schemas.microsoft.com/office/drawing/2016/5/13/chartex" xmlns:cx8="http://schemas.microsoft.com/office/drawing/2016/5/14/chartex" xmlns:mc="http://schemas.openxmlformats.org/markup-compatibility/2006" xmlns:aink="http://schemas.microsoft.com/office/drawing/2016/ink" xmlns:am3d="http://schemas.microsoft.com/office/drawing/2017/model3d" xmlns:o="urn:schemas-microsoft-com:office:office" xmlns:oel="http://schemas.microsoft.com/office/2019/extlst" xmlns:r="http://schemas.openxmlformats.org/officeDocument/2006/relationships" xmlns:m="http://schemas.openxmlformats.org/officeDocument/2006/math" xmlns:v="urn:schemas-microsoft-com:vml" xmlns:wp14="http://schemas.microsoft.com/office/word/2010/wordprocessingDrawing" xmlns:wp="http://schemas.openxmlformats.org/drawingml/2006/wordprocessingDrawing" xmlns:w10="urn:schemas-microsoft-com:office:word" xmlns:w="http://schemas.openxmlformats.org/wordprocessingml/2006/main" xmlns:w14="http://schemas.microsoft.com/office/word/2010/wordml" xmlns:w15="http://schemas.microsoft.com/office/word/2012/wordml" xmlns:w16cex="http://schemas.microsoft.com/office/word/2018/wordml/cex" xmlns:w16cid="http://schemas.microsoft.com/office/word/2016/wordml/cid" xmlns:w16="http://schemas.microsoft.com/office/word/2018/wordml" xmlns:w16du="http://schemas.microsoft.com/office/word/2023/wordml/word16du" xmlns:w16sdtdh="http://schemas.microsoft.com/office/word/2020/wordml/sdtdatahash" xmlns:w16sdtfl="http://schemas.microsoft.com/office/word/2024/wordml/sdtformatlock" xmlns:w16se="http://schemas.microsoft.com/office/word/2015/wordml/symex" xmlns:wpg="http://schemas.microsoft.com/office/word/2010/wordprocessingGroup" xmlns:wpi="http://schemas.microsoft.com/office/word/2010/wordprocessingInk" xmlns:wne="http://schemas.microsoft.com/office/word/2006/wordml" xmlns:wps="http://schemas.microsoft.com/office/word/2010/wordprocessingShape" mc:Ignorable="w14 w15 w16se w16cid w16 w16cex w16sdtdh w16sdtfl w16du wp14">
   <w:footnote w:type="separator" w:id="-1">
     <w:p>
       <w:pPr>
@@ -3386,7 +3422,7 @@
 </file>
 
 <file path=word/numbering.xml><?xml version="1.0" encoding="utf-8"?>
-<w:numbering xmlns:wpc="http://schemas.microsoft.com/office/word/2010/wordprocessingCanvas" xmlns:cx="http://schemas.microsoft.com/office/drawing/2014/chartex" xmlns:cx1="http://schemas.microsoft.com/office/drawing/2015/9/8/chartex" xmlns:cx2="http://schemas.microsoft.com/office/drawing/2015/10/21/chartex" xmlns:cx3="http://schemas.microsoft.com/office/drawing/2016/5/9/chartex" xmlns:cx4="http://schemas.microsoft.com/office/drawing/2016/5/10/chartex" xmlns:cx5="http://schemas.microsoft.com/office/drawing/2016/5/11/chartex" xmlns:cx6="http://schemas.microsoft.com/office/drawing/2016/5/12/chartex" xmlns:cx7="http://schemas.microsoft.com/office/drawing/2016/5/13/chartex" xmlns:cx8="http://schemas.microsoft.com/office/drawing/2016/5/14/chartex" xmlns:mc="http://schemas.openxmlformats.org/markup-compatibility/2006" xmlns:aink="http://schemas.microsoft.com/office/drawing/2016/ink" xmlns:am3d="http://schemas.microsoft.com/office/drawing/2017/model3d" xmlns:o="urn:schemas-microsoft-com:office:office" xmlns:r="http://schemas.openxmlformats.org/officeDocument/2006/relationships" xmlns:m="http://schemas.openxmlformats.org/officeDocument/2006/math" xmlns:v="urn:schemas-microsoft-com:vml" xmlns:wp14="http://schemas.microsoft.com/office/word/2010/wordprocessingDrawing" xmlns:wp="http://schemas.openxmlformats.org/drawingml/2006/wordprocessingDrawing" xmlns:w10="urn:schemas-microsoft-com:office:word" xmlns:w="http://schemas.openxmlformats.org/wordprocessingml/2006/main" xmlns:w14="http://schemas.microsoft.com/office/word/2010/wordml" xmlns:w15="http://schemas.microsoft.com/office/word/2012/wordml" xmlns:w16cex="http://schemas.microsoft.com/office/word/2018/wordml/cex" xmlns:w16cid="http://schemas.microsoft.com/office/word/2016/wordml/cid" xmlns:w16="http://schemas.microsoft.com/office/word/2018/wordml" xmlns:w16sdtdh="http://schemas.microsoft.com/office/word/2020/wordml/sdtdatahash" xmlns:w16se="http://schemas.microsoft.com/office/word/2015/wordml/symex" xmlns:wpg="http://schemas.microsoft.com/office/word/2010/wordprocessingGroup" xmlns:wpi="http://schemas.microsoft.com/office/word/2010/wordprocessingInk" xmlns:wne="http://schemas.microsoft.com/office/word/2006/wordml" xmlns:wps="http://schemas.microsoft.com/office/word/2010/wordprocessingShape" mc:Ignorable="w14 w15 w16se w16cid w16 w16cex w16sdtdh wp14">
+<w:numbering xmlns:wpc="http://schemas.microsoft.com/office/word/2010/wordprocessingCanvas" xmlns:cx="http://schemas.microsoft.com/office/drawing/2014/chartex" xmlns:cx1="http://schemas.microsoft.com/office/drawing/2015/9/8/chartex" xmlns:cx2="http://schemas.microsoft.com/office/drawing/2015/10/21/chartex" xmlns:cx3="http://schemas.microsoft.com/office/drawing/2016/5/9/chartex" xmlns:cx4="http://schemas.microsoft.com/office/drawing/2016/5/10/chartex" xmlns:cx5="http://schemas.microsoft.com/office/drawing/2016/5/11/chartex" xmlns:cx6="http://schemas.microsoft.com/office/drawing/2016/5/12/chartex" xmlns:cx7="http://schemas.microsoft.com/office/drawing/2016/5/13/chartex" xmlns:cx8="http://schemas.microsoft.com/office/drawing/2016/5/14/chartex" xmlns:mc="http://schemas.openxmlformats.org/markup-compatibility/2006" xmlns:aink="http://schemas.microsoft.com/office/drawing/2016/ink" xmlns:am3d="http://schemas.microsoft.com/office/drawing/2017/model3d" xmlns:o="urn:schemas-microsoft-com:office:office" xmlns:oel="http://schemas.microsoft.com/office/2019/extlst" xmlns:r="http://schemas.openxmlformats.org/officeDocument/2006/relationships" xmlns:m="http://schemas.openxmlformats.org/officeDocument/2006/math" xmlns:v="urn:schemas-microsoft-com:vml" xmlns:wp14="http://schemas.microsoft.com/office/word/2010/wordprocessingDrawing" xmlns:wp="http://schemas.openxmlformats.org/drawingml/2006/wordprocessingDrawing" xmlns:w10="urn:schemas-microsoft-com:office:word" xmlns:w="http://schemas.openxmlformats.org/wordprocessingml/2006/main" xmlns:w14="http://schemas.microsoft.com/office/word/2010/wordml" xmlns:w15="http://schemas.microsoft.com/office/word/2012/wordml" xmlns:w16cex="http://schemas.microsoft.com/office/word/2018/wordml/cex" xmlns:w16cid="http://schemas.microsoft.com/office/word/2016/wordml/cid" xmlns:w16="http://schemas.microsoft.com/office/word/2018/wordml" xmlns:w16du="http://schemas.microsoft.com/office/word/2023/wordml/word16du" xmlns:w16sdtdh="http://schemas.microsoft.com/office/word/2020/wordml/sdtdatahash" xmlns:w16sdtfl="http://schemas.microsoft.com/office/word/2024/wordml/sdtformatlock" xmlns:w16se="http://schemas.microsoft.com/office/word/2015/wordml/symex" xmlns:wpg="http://schemas.microsoft.com/office/word/2010/wordprocessingGroup" xmlns:wpi="http://schemas.microsoft.com/office/word/2010/wordprocessingInk" xmlns:wne="http://schemas.microsoft.com/office/word/2006/wordml" xmlns:wps="http://schemas.microsoft.com/office/word/2010/wordprocessingShape" mc:Ignorable="w14 w15 w16se w16cid w16 w16cex w16sdtdh w16sdtfl w16du wp14">
   <w:abstractNum w:abstractNumId="0" w15:restartNumberingAfterBreak="0">
     <w:nsid w:val="000D330F"/>
     <w:multiLevelType w:val="multilevel"/>
@@ -4154,32 +4190,32 @@
       </w:rPr>
     </w:lvl>
   </w:abstractNum>
-  <w:num w:numId="1">
+  <w:num w:numId="1" w16cid:durableId="526137805">
     <w:abstractNumId w:val="3"/>
   </w:num>
-  <w:num w:numId="2">
+  <w:num w:numId="2" w16cid:durableId="1786460482">
     <w:abstractNumId w:val="0"/>
   </w:num>
-  <w:num w:numId="3">
+  <w:num w:numId="3" w16cid:durableId="1111314462">
     <w:abstractNumId w:val="2"/>
   </w:num>
-  <w:num w:numId="4">
+  <w:num w:numId="4" w16cid:durableId="421605370">
     <w:abstractNumId w:val="5"/>
   </w:num>
-  <w:num w:numId="5">
+  <w:num w:numId="5" w16cid:durableId="1969965169">
     <w:abstractNumId w:val="6"/>
   </w:num>
-  <w:num w:numId="6">
+  <w:num w:numId="6" w16cid:durableId="1275136540">
     <w:abstractNumId w:val="4"/>
   </w:num>
-  <w:num w:numId="7">
+  <w:num w:numId="7" w16cid:durableId="1339190418">
     <w:abstractNumId w:val="1"/>
   </w:num>
 </w:numbering>
 </file>
 
 <file path=word/styles.xml><?xml version="1.0" encoding="utf-8"?>
-<w:styles xmlns:mc="http://schemas.openxmlformats.org/markup-compatibility/2006" xmlns:r="http://schemas.openxmlformats.org/officeDocument/2006/relationships" xmlns:w="http://schemas.openxmlformats.org/wordprocessingml/2006/main" xmlns:w14="http://schemas.microsoft.com/office/word/2010/wordml" xmlns:w15="http://schemas.microsoft.com/office/word/2012/wordml" xmlns:w16cex="http://schemas.microsoft.com/office/word/2018/wordml/cex" xmlns:w16cid="http://schemas.microsoft.com/office/word/2016/wordml/cid" xmlns:w16="http://schemas.microsoft.com/office/word/2018/wordml" xmlns:w16sdtdh="http://schemas.microsoft.com/office/word/2020/wordml/sdtdatahash" xmlns:w16se="http://schemas.microsoft.com/office/word/2015/wordml/symex" mc:Ignorable="w14 w15 w16se w16cid w16 w16cex w16sdtdh">
+<w:styles xmlns:mc="http://schemas.openxmlformats.org/markup-compatibility/2006" xmlns:r="http://schemas.openxmlformats.org/officeDocument/2006/relationships" xmlns:w="http://schemas.openxmlformats.org/wordprocessingml/2006/main" xmlns:w14="http://schemas.microsoft.com/office/word/2010/wordml" xmlns:w15="http://schemas.microsoft.com/office/word/2012/wordml" xmlns:w16cex="http://schemas.microsoft.com/office/word/2018/wordml/cex" xmlns:w16cid="http://schemas.microsoft.com/office/word/2016/wordml/cid" xmlns:w16="http://schemas.microsoft.com/office/word/2018/wordml" xmlns:w16du="http://schemas.microsoft.com/office/word/2023/wordml/word16du" xmlns:w16sdtdh="http://schemas.microsoft.com/office/word/2020/wordml/sdtdatahash" xmlns:w16sdtfl="http://schemas.microsoft.com/office/word/2024/wordml/sdtformatlock" xmlns:w16se="http://schemas.microsoft.com/office/word/2015/wordml/symex" mc:Ignorable="w14 w15 w16se w16cid w16 w16cex w16sdtdh w16sdtfl w16du">
   <w:docDefaults>
     <w:rPrDefault>
       <w:rPr>
@@ -5357,6 +5393,30 @@
     <w:basedOn w:val="DefaultParagraphFont"/>
     <w:rsid w:val="00FF5832"/>
   </w:style>
+  <w:style w:type="character" w:styleId="UnresolvedMention">
+    <w:name w:val="Unresolved Mention"/>
+    <w:basedOn w:val="DefaultParagraphFont"/>
+    <w:uiPriority w:val="99"/>
+    <w:semiHidden/>
+    <w:unhideWhenUsed/>
+    <w:rsid w:val="00FA20AE"/>
+    <w:rPr>
+      <w:color w:val="605E5C"/>
+      <w:shd w:val="clear" w:color="auto" w:fill="E1DFDD"/>
+    </w:rPr>
+  </w:style>
+  <w:style w:type="character" w:styleId="FollowedHyperlink">
+    <w:name w:val="FollowedHyperlink"/>
+    <w:basedOn w:val="DefaultParagraphFont"/>
+    <w:uiPriority w:val="99"/>
+    <w:semiHidden/>
+    <w:unhideWhenUsed/>
+    <w:rsid w:val="00FA20AE"/>
+    <w:rPr>
+      <w:color w:val="96607D" w:themeColor="followedHyperlink"/>
+      <w:u w:val="single"/>
+    </w:rPr>
+  </w:style>
 </w:styles>
 </file>
 

</xml_diff>